<commit_message>
NAT removal, t3.small -> t3.micro, docs update and force_destroy = true addition
</commit_message>
<xml_diff>
--- a/docs/Documentacao_MVP_Mercantis.docx
+++ b/docs/Documentacao_MVP_Mercantis.docx
@@ -4,6 +4,7 @@
   <w:body>
     <w:p>
       <w:pPr>
+        <w:spacing w:before="2600"/>
         <w:jc w:val="center"/>
       </w:pPr>
       <w:r>
@@ -28,7 +29,25 @@
           <w:sz w:val="40"/>
           <w:szCs w:val="40"/>
         </w:rPr>
-        <w:t>Documentação do MVP — Mercantis</w:t>
+        <w:t xml:space="preserve">Documentação do MVP </w:t>
+      </w:r>
+      <w:r>
+        <w:rPr>
+          <w:b/>
+          <w:bCs/>
+          <w:sz w:val="40"/>
+          <w:szCs w:val="40"/>
+        </w:rPr>
+        <w:t>-</w:t>
+      </w:r>
+      <w:r>
+        <w:rPr>
+          <w:b/>
+          <w:bCs/>
+          <w:sz w:val="40"/>
+          <w:szCs w:val="40"/>
+        </w:rPr>
+        <w:t xml:space="preserve"> Mercantis</w:t>
       </w:r>
     </w:p>
     <w:p>
@@ -47,83 +66,21 @@
           <w:sz w:val="24"/>
           <w:szCs w:val="24"/>
         </w:rPr>
-        <w:t>Infraestrutura como código (</w:t>
-      </w:r>
-      <w:proofErr w:type="spellStart"/>
+        <w:t>Infraestrutura como código (Terraform) · Frontend em Docker · RDS MariaDB</w:t>
+      </w:r>
+    </w:p>
+    <w:p>
+      <w:pPr>
+        <w:spacing w:before="200"/>
+        <w:jc w:val="center"/>
+      </w:pPr>
       <w:r>
         <w:rPr>
           <w:color w:val="555555"/>
           <w:sz w:val="24"/>
           <w:szCs w:val="24"/>
         </w:rPr>
-        <w:t>Terraform</w:t>
-      </w:r>
-      <w:proofErr w:type="spellEnd"/>
-      <w:r>
-        <w:rPr>
-          <w:color w:val="555555"/>
-          <w:sz w:val="24"/>
-          <w:szCs w:val="24"/>
-        </w:rPr>
-        <w:t xml:space="preserve">) · </w:t>
-      </w:r>
-      <w:proofErr w:type="spellStart"/>
-      <w:r>
-        <w:rPr>
-          <w:color w:val="555555"/>
-          <w:sz w:val="24"/>
-          <w:szCs w:val="24"/>
-        </w:rPr>
-        <w:t>Frontend</w:t>
-      </w:r>
-      <w:proofErr w:type="spellEnd"/>
-      <w:r>
-        <w:rPr>
-          <w:color w:val="555555"/>
-          <w:sz w:val="24"/>
-          <w:szCs w:val="24"/>
-        </w:rPr>
-        <w:t xml:space="preserve"> em Docker · RDS </w:t>
-      </w:r>
-      <w:proofErr w:type="spellStart"/>
-      <w:r>
-        <w:rPr>
-          <w:color w:val="555555"/>
-          <w:sz w:val="24"/>
-          <w:szCs w:val="24"/>
-        </w:rPr>
-        <w:t>MariaDB</w:t>
-      </w:r>
-      <w:proofErr w:type="spellEnd"/>
-    </w:p>
-    <w:p>
-      <w:pPr>
-        <w:spacing w:before="200"/>
-        <w:jc w:val="center"/>
-      </w:pPr>
-      <w:r>
-        <w:rPr>
-          <w:color w:val="555555"/>
-          <w:sz w:val="24"/>
-          <w:szCs w:val="24"/>
-        </w:rPr>
-        <w:t>Luiz Felipe Pimenta Berrettini</w:t>
-      </w:r>
-      <w:r>
-        <w:rPr>
-          <w:color w:val="555555"/>
-          <w:sz w:val="24"/>
-          <w:szCs w:val="24"/>
-        </w:rPr>
-        <w:t xml:space="preserve"> |</w:t>
-      </w:r>
-      <w:r>
-        <w:rPr>
-          <w:color w:val="555555"/>
-          <w:sz w:val="24"/>
-          <w:szCs w:val="24"/>
-        </w:rPr>
-        <w:t xml:space="preserve"> RA: 245388</w:t>
+        <w:t>Luiz Felipe Pimenta Berrettini | RA: 245388</w:t>
       </w:r>
     </w:p>
     <w:p>
@@ -132,21 +89,7 @@
         <w:jc w:val="center"/>
       </w:pPr>
       <w:r>
-        <w:t xml:space="preserve">TI5A </w:t>
-      </w:r>
-      <w:r>
-        <w:t>-</w:t>
-      </w:r>
-      <w:r>
-        <w:t xml:space="preserve"> Cloud </w:t>
-      </w:r>
-      <w:proofErr w:type="spellStart"/>
-      <w:r>
-        <w:t>Computing</w:t>
-      </w:r>
-      <w:proofErr w:type="spellEnd"/>
-      <w:r>
-        <w:t xml:space="preserve"> · ESPM · Semestre 2026-I</w:t>
+        <w:t>TI5A — Cloud Computing · ESPM · Semestre 2026-I</w:t>
       </w:r>
     </w:p>
     <w:p>
@@ -394,31 +337,7 @@
         <w:spacing w:after="140" w:line="276" w:lineRule="auto"/>
       </w:pPr>
       <w:r>
-        <w:t xml:space="preserve">Este documento descreve o MVP de migração do portal de e-commerce da Mercantis para a nuvem AWS. A Mercantis opera há cerca de dez anos um portal de vendas hospedado em ambiente </w:t>
-      </w:r>
-      <w:proofErr w:type="spellStart"/>
-      <w:r>
-        <w:t>on-premises</w:t>
-      </w:r>
-      <w:proofErr w:type="spellEnd"/>
-      <w:r>
-        <w:t xml:space="preserve">. Uma tempestade derrubou a energia, os </w:t>
-      </w:r>
-      <w:proofErr w:type="spellStart"/>
-      <w:r>
-        <w:t>no-breaks</w:t>
-      </w:r>
-      <w:proofErr w:type="spellEnd"/>
-      <w:r>
-        <w:t xml:space="preserve"> não aguentaram, e o portal saiu do ar por horas. A consultoria que avaliou o ambiente encontrou três problemas centrais: um firewall de borda sem capacidade de inspecionar requisições da aplicação, o servidor web Apache e o banco </w:t>
-      </w:r>
-      <w:proofErr w:type="spellStart"/>
-      <w:r>
-        <w:t>MariaDB</w:t>
-      </w:r>
-      <w:proofErr w:type="spellEnd"/>
-      <w:r>
-        <w:t xml:space="preserve"> no mesmo segmento de rede público, e nenhuma redundância para absorver picos de tráfego ou falhas de hardware.</w:t>
+        <w:t>Este documento descreve o MVP de migração do portal de e-commerce da Mercantis para a nuvem AWS. A Mercantis opera há cerca de dez anos um portal de vendas hospedado em ambiente on-premises. Uma tempestade derrubou a energia, os no-breaks não aguentaram, e o portal saiu do ar por horas. A consultoria que avaliou o ambiente encontrou três problemas centrais: um firewall de borda sem capacidade de inspecionar requisições da aplicação, o servidor web Apache e o banco MariaDB no mesmo segmento de rede público, e nenhuma redundância para absorver picos de tráfego ou falhas de hardware.</w:t>
       </w:r>
     </w:p>
     <w:p>
@@ -426,55 +345,7 @@
         <w:spacing w:after="140" w:line="276" w:lineRule="auto"/>
       </w:pPr>
       <w:r>
-        <w:t xml:space="preserve">O MVP responde a esses problemas com uma arquitetura enxuta na AWS, provisionada por </w:t>
-      </w:r>
-      <w:proofErr w:type="spellStart"/>
-      <w:r>
-        <w:t>Terraform</w:t>
-      </w:r>
-      <w:proofErr w:type="spellEnd"/>
-      <w:r>
-        <w:t xml:space="preserve">. Ele entrega o caminho crítico da migração: o </w:t>
-      </w:r>
-      <w:proofErr w:type="spellStart"/>
-      <w:r>
-        <w:t>frontend</w:t>
-      </w:r>
-      <w:proofErr w:type="spellEnd"/>
-      <w:r>
-        <w:t xml:space="preserve"> roda em um container Docker sobre EC2, o banco passa a ser um </w:t>
-      </w:r>
-      <w:proofErr w:type="spellStart"/>
-      <w:r>
-        <w:t>Amazon</w:t>
-      </w:r>
-      <w:proofErr w:type="spellEnd"/>
-      <w:r>
-        <w:t xml:space="preserve"> RDS </w:t>
-      </w:r>
-      <w:proofErr w:type="spellStart"/>
-      <w:r>
-        <w:t>MariaDB</w:t>
-      </w:r>
-      <w:proofErr w:type="spellEnd"/>
-      <w:r>
-        <w:t xml:space="preserve"> gerenciado em </w:t>
-      </w:r>
-      <w:proofErr w:type="spellStart"/>
-      <w:r>
-        <w:t>sub-rede</w:t>
-      </w:r>
-      <w:proofErr w:type="spellEnd"/>
-      <w:r>
-        <w:t xml:space="preserve"> privada, e a borda ganha </w:t>
-      </w:r>
-      <w:proofErr w:type="spellStart"/>
-      <w:r>
-        <w:t>CloudFront</w:t>
-      </w:r>
-      <w:proofErr w:type="spellEnd"/>
-      <w:r>
-        <w:t>, AWS WAF e AWS Shield. Sobre o diagrama-base fornecido, acrescentei controles de segurança adicionais descritos na seção 6.</w:t>
+        <w:t>O MVP responde a esses problemas com uma arquitetura enxuta na AWS, provisionada por Terraform. Ele entrega o caminho crítico da migração: o frontend roda em um container Docker sobre EC2, o banco passa a ser um Amazon RDS MariaDB gerenciado em sub-rede privada, e a borda ganha CloudFront, AWS WAF e AWS Shield. Sobre o diagrama-base fornecido, acrescentei controles de segurança adicionais descritos na seção 6.</w:t>
       </w:r>
     </w:p>
     <w:p>
@@ -489,33 +360,8 @@
         <w:t xml:space="preserve">Escopo. </w:t>
       </w:r>
       <w:r>
-        <w:t xml:space="preserve">O MVP </w:t>
-      </w:r>
-      <w:proofErr w:type="spellStart"/>
-      <w:r>
-        <w:t>valida</w:t>
-      </w:r>
-      <w:proofErr w:type="spellEnd"/>
-      <w:r>
-        <w:t xml:space="preserve"> a arquitetura, a segurança de rede e a separação entre camadas. Ele não cobre ainda o auto </w:t>
-      </w:r>
-      <w:proofErr w:type="spellStart"/>
-      <w:r>
-        <w:t>scaling</w:t>
-      </w:r>
-      <w:proofErr w:type="spellEnd"/>
-      <w:r>
-        <w:t xml:space="preserve">, o balanceador de carga e o </w:t>
-      </w:r>
-      <w:proofErr w:type="spellStart"/>
-      <w:r>
-        <w:t>Multi-AZ</w:t>
-      </w:r>
-      <w:proofErr w:type="spellEnd"/>
-      <w:r>
-        <w:t xml:space="preserve"> completo, reservados para a arquitetura final (seção 4). A estratégia de migração combina </w:t>
-      </w:r>
-      <w:proofErr w:type="spellStart"/>
+        <w:t xml:space="preserve">O MVP valida a arquitetura, a segurança de rede e a separação entre camadas. Ele não cobre ainda o auto scaling, o balanceador de carga e o Multi-AZ completo, reservados para a arquitetura final (seção 4). A estratégia de migração combina </w:t>
+      </w:r>
       <w:r>
         <w:rPr>
           <w:i/>
@@ -523,11 +369,9 @@
         </w:rPr>
         <w:t>replatform</w:t>
       </w:r>
-      <w:proofErr w:type="spellEnd"/>
       <w:r>
         <w:t xml:space="preserve"> (banco gerenciado no RDS) com </w:t>
       </w:r>
-      <w:proofErr w:type="spellStart"/>
       <w:r>
         <w:rPr>
           <w:i/>
@@ -535,17 +379,8 @@
         </w:rPr>
         <w:t>refactor</w:t>
       </w:r>
-      <w:proofErr w:type="spellEnd"/>
-      <w:r>
-        <w:t xml:space="preserve"> leve (</w:t>
-      </w:r>
-      <w:proofErr w:type="spellStart"/>
-      <w:r>
-        <w:t>frontend</w:t>
-      </w:r>
-      <w:proofErr w:type="spellEnd"/>
-      <w:r>
-        <w:t xml:space="preserve"> conteinerizado), em linha com as opções discutidas no roteiro move2cloud da disciplina.</w:t>
+      <w:r>
+        <w:t xml:space="preserve"> leve (frontend conteinerizado), em linha com as opções discutidas no roteiro move2cloud da disciplina.</w:t>
       </w:r>
     </w:p>
     <w:p>
@@ -569,15 +404,7 @@
         <w:spacing w:after="140" w:line="276" w:lineRule="auto"/>
       </w:pPr>
       <w:r>
-        <w:t xml:space="preserve">O portal real da Mercantis é uma loja virtual de catálogo amplo, voltada ao mercado nacional. Os clientes navegam por categorias, pesquisam produtos, montam o carrinho, criam conta, fazem login, finalizam a compra e acompanham pedidos. A operação valoriza preço competitivo e entrega rápida, e sofre nos períodos de pico, como datas comemorativas e promoções, quando a arquitetura estática </w:t>
-      </w:r>
-      <w:proofErr w:type="spellStart"/>
-      <w:r>
-        <w:t>on-premises</w:t>
-      </w:r>
-      <w:proofErr w:type="spellEnd"/>
-      <w:r>
-        <w:t xml:space="preserve"> não acompanha o aumento de acessos. Os clientes distantes do data center também enfrentam lentidão, porque não há distribuição de conteúdo por regiões.</w:t>
+        <w:t>O portal real da Mercantis é uma loja virtual de catálogo amplo, voltada ao mercado nacional. Os clientes navegam por categorias, pesquisam produtos, montam o carrinho, criam conta, fazem login, finalizam a compra e acompanham pedidos. A operação valoriza preço competitivo e entrega rápida, e sofre nos períodos de pico, como datas comemorativas e promoções, quando a arquitetura estática on-premises não acompanha o aumento de acessos. Os clientes distantes do data center também enfrentam lentidão, porque não há distribuição de conteúdo por regiões.</w:t>
       </w:r>
     </w:p>
     <w:p>
@@ -601,71 +428,7 @@
         <w:spacing w:after="140" w:line="276" w:lineRule="auto"/>
       </w:pPr>
       <w:r>
-        <w:t xml:space="preserve">O MVP reproduz a espinha dorsal dessa aplicação sem recriar todas as integrações. Uma única instância EC2 executa o container do </w:t>
-      </w:r>
-      <w:proofErr w:type="spellStart"/>
-      <w:r>
-        <w:t>frontend</w:t>
-      </w:r>
-      <w:proofErr w:type="spellEnd"/>
-      <w:r>
-        <w:t xml:space="preserve">, que representa a camada web e de aplicação do portal. O </w:t>
-      </w:r>
-      <w:proofErr w:type="spellStart"/>
-      <w:r>
-        <w:t>Amazon</w:t>
-      </w:r>
-      <w:proofErr w:type="spellEnd"/>
-      <w:r>
-        <w:t xml:space="preserve"> RDS </w:t>
-      </w:r>
-      <w:proofErr w:type="spellStart"/>
-      <w:r>
-        <w:t>MariaDB</w:t>
-      </w:r>
-      <w:proofErr w:type="spellEnd"/>
-      <w:r>
-        <w:t xml:space="preserve"> substitui o banco que antes rodava no servidor dedicado </w:t>
-      </w:r>
-      <w:proofErr w:type="spellStart"/>
-      <w:r>
-        <w:t>on-premises</w:t>
-      </w:r>
-      <w:proofErr w:type="spellEnd"/>
-      <w:r>
-        <w:t xml:space="preserve">, agora isolado em </w:t>
-      </w:r>
-      <w:proofErr w:type="spellStart"/>
-      <w:r>
-        <w:t>sub-rede</w:t>
-      </w:r>
-      <w:proofErr w:type="spellEnd"/>
-      <w:r>
-        <w:t xml:space="preserve"> privada. Um </w:t>
-      </w:r>
-      <w:proofErr w:type="spellStart"/>
-      <w:r>
-        <w:t>bucket</w:t>
-      </w:r>
-      <w:proofErr w:type="spellEnd"/>
-      <w:r>
-        <w:t xml:space="preserve"> S3 guarda os arquivos estáticos, como imagens, CSS e </w:t>
-      </w:r>
-      <w:proofErr w:type="spellStart"/>
-      <w:r>
-        <w:t>JavaScript</w:t>
-      </w:r>
-      <w:proofErr w:type="spellEnd"/>
-      <w:r>
-        <w:t xml:space="preserve">, que o </w:t>
-      </w:r>
-      <w:proofErr w:type="spellStart"/>
-      <w:r>
-        <w:t>CloudFront</w:t>
-      </w:r>
-      <w:proofErr w:type="spellEnd"/>
-      <w:r>
-        <w:t xml:space="preserve"> distribui com baixa latência.</w:t>
+        <w:t>O MVP reproduz a espinha dorsal dessa aplicação sem recriar todas as integrações. Uma única instância EC2 executa o container do frontend, que representa a camada web e de aplicação do portal. O Amazon RDS MariaDB substitui o banco que antes rodava no servidor dedicado on-premises, agora isolado em sub-rede privada. Um bucket S3 guarda os arquivos estáticos, como imagens, CSS e JavaScript, que o CloudFront distribui com baixa latência.</w:t>
       </w:r>
     </w:p>
     <w:p>
@@ -674,15 +437,7 @@
       </w:pPr>
       <w:r>
         <w:lastRenderedPageBreak/>
-        <w:t xml:space="preserve">A imagem Docker padrão do MVP é uma aplicação de demonstração. Para usar a loja real, basta publicar a imagem da Mercantis em um registry e apontar a variável </w:t>
-      </w:r>
-      <w:proofErr w:type="spellStart"/>
-      <w:r>
-        <w:t>frontend_image</w:t>
-      </w:r>
-      <w:proofErr w:type="spellEnd"/>
-      <w:r>
-        <w:t>, como descreve o README. A arquitetura de rede, segurança e dados permanece a mesma.</w:t>
+        <w:t>A imagem Docker padrão do MVP é uma aplicação de demonstração. Para usar a loja real, basta publicar a imagem da Mercantis em um registry e apontar a variável frontend_image, como descreve o README. A arquitetura de rede, segurança e dados permanece a mesma.</w:t>
       </w:r>
     </w:p>
     <w:tbl>
@@ -700,7 +455,7 @@
           <w:left w:w="10" w:type="dxa"/>
           <w:right w:w="10" w:type="dxa"/>
         </w:tblCellMar>
-        <w:tblLook w:val="04A0" w:firstRow="1" w:lastRow="0" w:firstColumn="1" w:lastColumn="0" w:noHBand="0" w:noVBand="1"/>
+        <w:tblLook w:val="0000" w:firstRow="0" w:lastRow="0" w:firstColumn="0" w:lastColumn="0" w:noHBand="0" w:noVBand="0"/>
       </w:tblPr>
       <w:tblGrid>
         <w:gridCol w:w="2200"/>
@@ -857,18 +612,8 @@
                 <w:sz w:val="19"/>
                 <w:szCs w:val="19"/>
               </w:rPr>
-              <w:t xml:space="preserve">Vários servidores atrás de balanceador, com auto </w:t>
-            </w:r>
-            <w:proofErr w:type="spellStart"/>
-            <w:r>
-              <w:rPr>
-                <w:color w:val="111111"/>
-                <w:sz w:val="19"/>
-                <w:szCs w:val="19"/>
-              </w:rPr>
-              <w:t>scaling</w:t>
-            </w:r>
-            <w:proofErr w:type="spellEnd"/>
+              <w:t>Vários servidores atrás de balanceador, com auto scaling</w:t>
+            </w:r>
           </w:p>
         </w:tc>
         <w:tc>
@@ -947,23 +692,13 @@
             <w:pPr>
               <w:spacing w:line="252" w:lineRule="auto"/>
             </w:pPr>
-            <w:proofErr w:type="spellStart"/>
-            <w:r>
-              <w:rPr>
-                <w:color w:val="111111"/>
-                <w:sz w:val="19"/>
-                <w:szCs w:val="19"/>
-              </w:rPr>
-              <w:t>MariaDB</w:t>
-            </w:r>
-            <w:proofErr w:type="spellEnd"/>
-            <w:r>
-              <w:rPr>
-                <w:color w:val="111111"/>
-                <w:sz w:val="19"/>
-                <w:szCs w:val="19"/>
-              </w:rPr>
-              <w:t xml:space="preserve"> com réplicas e alta disponibilidade</w:t>
+            <w:r>
+              <w:rPr>
+                <w:color w:val="111111"/>
+                <w:sz w:val="19"/>
+                <w:szCs w:val="19"/>
+              </w:rPr>
+              <w:t>MariaDB com réplicas e alta disponibilidade</w:t>
             </w:r>
           </w:p>
         </w:tc>
@@ -989,43 +724,7 @@
                 <w:sz w:val="19"/>
                 <w:szCs w:val="19"/>
               </w:rPr>
-              <w:t xml:space="preserve">RDS </w:t>
-            </w:r>
-            <w:proofErr w:type="spellStart"/>
-            <w:r>
-              <w:rPr>
-                <w:color w:val="111111"/>
-                <w:sz w:val="19"/>
-                <w:szCs w:val="19"/>
-              </w:rPr>
-              <w:t>MariaDB</w:t>
-            </w:r>
-            <w:proofErr w:type="spellEnd"/>
-            <w:r>
-              <w:rPr>
-                <w:color w:val="111111"/>
-                <w:sz w:val="19"/>
-                <w:szCs w:val="19"/>
-              </w:rPr>
-              <w:t xml:space="preserve"> single-AZ (</w:t>
-            </w:r>
-            <w:proofErr w:type="spellStart"/>
-            <w:r>
-              <w:rPr>
-                <w:color w:val="111111"/>
-                <w:sz w:val="19"/>
-                <w:szCs w:val="19"/>
-              </w:rPr>
-              <w:t>Multi-AZ</w:t>
-            </w:r>
-            <w:proofErr w:type="spellEnd"/>
-            <w:r>
-              <w:rPr>
-                <w:color w:val="111111"/>
-                <w:sz w:val="19"/>
-                <w:szCs w:val="19"/>
-              </w:rPr>
-              <w:t xml:space="preserve"> na arquitetura final)</w:t>
+              <w:t>RDS MariaDB single-AZ (Multi-AZ na arquitetura final)</w:t>
             </w:r>
           </w:p>
         </w:tc>
@@ -1085,25 +784,7 @@
                 <w:sz w:val="19"/>
                 <w:szCs w:val="19"/>
               </w:rPr>
-              <w:t xml:space="preserve">CDN sobre </w:t>
-            </w:r>
-            <w:proofErr w:type="spellStart"/>
-            <w:r>
-              <w:rPr>
-                <w:color w:val="111111"/>
-                <w:sz w:val="19"/>
-                <w:szCs w:val="19"/>
-              </w:rPr>
-              <w:t>bucket</w:t>
-            </w:r>
-            <w:proofErr w:type="spellEnd"/>
-            <w:r>
-              <w:rPr>
-                <w:color w:val="111111"/>
-                <w:sz w:val="19"/>
-                <w:szCs w:val="19"/>
-              </w:rPr>
-              <w:t xml:space="preserve"> de objetos</w:t>
+              <w:t>CDN sobre bucket de objetos</w:t>
             </w:r>
           </w:p>
         </w:tc>
@@ -1129,25 +810,7 @@
                 <w:sz w:val="19"/>
                 <w:szCs w:val="19"/>
               </w:rPr>
-              <w:t xml:space="preserve">S3 privado servido via </w:t>
-            </w:r>
-            <w:proofErr w:type="spellStart"/>
-            <w:r>
-              <w:rPr>
-                <w:color w:val="111111"/>
-                <w:sz w:val="19"/>
-                <w:szCs w:val="19"/>
-              </w:rPr>
-              <w:t>CloudFront</w:t>
-            </w:r>
-            <w:proofErr w:type="spellEnd"/>
-            <w:r>
-              <w:rPr>
-                <w:color w:val="111111"/>
-                <w:sz w:val="19"/>
-                <w:szCs w:val="19"/>
-              </w:rPr>
-              <w:t xml:space="preserve"> (OAC)</w:t>
+              <w:t>S3 privado servido via CloudFront (OAC)</w:t>
             </w:r>
           </w:p>
         </w:tc>
@@ -1201,23 +864,13 @@
             <w:pPr>
               <w:spacing w:line="252" w:lineRule="auto"/>
             </w:pPr>
-            <w:proofErr w:type="spellStart"/>
-            <w:r>
-              <w:rPr>
-                <w:color w:val="111111"/>
-                <w:sz w:val="19"/>
-                <w:szCs w:val="19"/>
-              </w:rPr>
-              <w:t>Multi-AZ</w:t>
-            </w:r>
-            <w:proofErr w:type="spellEnd"/>
-            <w:r>
-              <w:rPr>
-                <w:color w:val="111111"/>
-                <w:sz w:val="19"/>
-                <w:szCs w:val="19"/>
-              </w:rPr>
-              <w:t>, tolerante a falhas</w:t>
+            <w:r>
+              <w:rPr>
+                <w:color w:val="111111"/>
+                <w:sz w:val="19"/>
+                <w:szCs w:val="19"/>
+              </w:rPr>
+              <w:t>Multi-AZ, tolerante a falhas</w:t>
             </w:r>
           </w:p>
         </w:tc>
@@ -1243,25 +896,7 @@
                 <w:sz w:val="19"/>
                 <w:szCs w:val="19"/>
               </w:rPr>
-              <w:t xml:space="preserve">AZ única para compute; 2 </w:t>
-            </w:r>
-            <w:proofErr w:type="spellStart"/>
-            <w:r>
-              <w:rPr>
-                <w:color w:val="111111"/>
-                <w:sz w:val="19"/>
-                <w:szCs w:val="19"/>
-              </w:rPr>
-              <w:t>AZs</w:t>
-            </w:r>
-            <w:proofErr w:type="spellEnd"/>
-            <w:r>
-              <w:rPr>
-                <w:color w:val="111111"/>
-                <w:sz w:val="19"/>
-                <w:szCs w:val="19"/>
-              </w:rPr>
-              <w:t xml:space="preserve"> já provisionadas na rede</w:t>
+              <w:t>AZ única para compute; 2 AZs já provisionadas na rede</w:t>
             </w:r>
           </w:p>
         </w:tc>
@@ -1321,18 +956,8 @@
                 <w:sz w:val="19"/>
                 <w:szCs w:val="19"/>
               </w:rPr>
-              <w:t xml:space="preserve">WAF, Shield, TLS, proteção </w:t>
-            </w:r>
-            <w:proofErr w:type="spellStart"/>
-            <w:r>
-              <w:rPr>
-                <w:color w:val="111111"/>
-                <w:sz w:val="19"/>
-                <w:szCs w:val="19"/>
-              </w:rPr>
-              <w:t>DDoS</w:t>
-            </w:r>
-            <w:proofErr w:type="spellEnd"/>
+              <w:t>WAF, Shield, TLS, proteção DDoS</w:t>
+            </w:r>
           </w:p>
         </w:tc>
         <w:tc>
@@ -1357,25 +982,7 @@
                 <w:sz w:val="19"/>
                 <w:szCs w:val="19"/>
               </w:rPr>
-              <w:t xml:space="preserve">WAF + Shield Standard + </w:t>
-            </w:r>
-            <w:proofErr w:type="spellStart"/>
-            <w:r>
-              <w:rPr>
-                <w:color w:val="111111"/>
-                <w:sz w:val="19"/>
-                <w:szCs w:val="19"/>
-              </w:rPr>
-              <w:t>CloudFront</w:t>
-            </w:r>
-            <w:proofErr w:type="spellEnd"/>
-            <w:r>
-              <w:rPr>
-                <w:color w:val="111111"/>
-                <w:sz w:val="19"/>
-                <w:szCs w:val="19"/>
-              </w:rPr>
-              <w:t xml:space="preserve"> com HTTPS</w:t>
+              <w:t>WAF + Shield Standard + CloudFront com HTTPS</w:t>
             </w:r>
           </w:p>
         </w:tc>
@@ -1437,23 +1044,7 @@
         <w:spacing w:after="80" w:line="268" w:lineRule="auto"/>
       </w:pPr>
       <w:r>
-        <w:t xml:space="preserve">Catálogo e busca: listagem de produtos por categoria e pesquisa. As imagens vêm do S3 via </w:t>
-      </w:r>
-      <w:proofErr w:type="spellStart"/>
-      <w:r>
-        <w:t>CloudFront</w:t>
-      </w:r>
-      <w:proofErr w:type="spellEnd"/>
-      <w:r>
-        <w:t xml:space="preserve">; os dados de produto vêm do RDS </w:t>
-      </w:r>
-      <w:proofErr w:type="spellStart"/>
-      <w:r>
-        <w:t>MariaDB</w:t>
-      </w:r>
-      <w:proofErr w:type="spellEnd"/>
-      <w:r>
-        <w:t>.</w:t>
+        <w:t>Catálogo e busca: listagem de produtos por categoria e pesquisa. As imagens vêm do S3 via CloudFront; os dados de produto vêm do RDS MariaDB.</w:t>
       </w:r>
     </w:p>
     <w:p>
@@ -1466,23 +1057,7 @@
         <w:spacing w:after="80" w:line="268" w:lineRule="auto"/>
       </w:pPr>
       <w:r>
-        <w:t xml:space="preserve">Cadastro de usuários: criação de conta com e-mail e senha. Os registros ficam no </w:t>
-      </w:r>
-      <w:proofErr w:type="spellStart"/>
-      <w:r>
-        <w:t>MariaDB</w:t>
-      </w:r>
-      <w:proofErr w:type="spellEnd"/>
-      <w:r>
-        <w:t xml:space="preserve">; as senhas devem ser armazenadas com </w:t>
-      </w:r>
-      <w:proofErr w:type="spellStart"/>
-      <w:r>
-        <w:t>hash</w:t>
-      </w:r>
-      <w:proofErr w:type="spellEnd"/>
-      <w:r>
-        <w:t xml:space="preserve"> forte pela aplicação.</w:t>
+        <w:t>Cadastro de usuários: criação de conta com e-mail e senha. Os registros ficam no MariaDB; as senhas devem ser armazenadas com hash forte pela aplicação.</w:t>
       </w:r>
     </w:p>
     <w:p>
@@ -1534,31 +1109,7 @@
         <w:spacing w:after="80" w:line="268" w:lineRule="auto"/>
       </w:pPr>
       <w:r>
-        <w:t xml:space="preserve">Conteúdo estático: páginas, imagens, folhas de estilo e scripts entregues pelo </w:t>
-      </w:r>
-      <w:proofErr w:type="spellStart"/>
-      <w:r>
-        <w:t>CloudFront</w:t>
-      </w:r>
-      <w:proofErr w:type="spellEnd"/>
-      <w:r>
-        <w:t xml:space="preserve"> a partir do </w:t>
-      </w:r>
-      <w:proofErr w:type="spellStart"/>
-      <w:r>
-        <w:t>bucket</w:t>
-      </w:r>
-      <w:proofErr w:type="spellEnd"/>
-      <w:r>
-        <w:t xml:space="preserve"> S3, sob o prefixo /</w:t>
-      </w:r>
-      <w:proofErr w:type="spellStart"/>
-      <w:r>
-        <w:t>static</w:t>
-      </w:r>
-      <w:proofErr w:type="spellEnd"/>
-      <w:r>
-        <w:t>/.</w:t>
+        <w:t>Conteúdo estático: páginas, imagens, folhas de estilo e scripts entregues pelo CloudFront a partir do bucket S3, sob o prefixo /static/.</w:t>
       </w:r>
     </w:p>
     <w:p>
@@ -1574,55 +1125,7 @@
         <w:spacing w:after="140" w:line="276" w:lineRule="auto"/>
       </w:pPr>
       <w:r>
-        <w:t xml:space="preserve">O usuário acessa a URL do </w:t>
-      </w:r>
-      <w:proofErr w:type="spellStart"/>
-      <w:r>
-        <w:t>CloudFront</w:t>
-      </w:r>
-      <w:proofErr w:type="spellEnd"/>
-      <w:r>
-        <w:t xml:space="preserve">. A requisição passa pelo AWS WAF, que filtra ataques comuns e aplica limite de taxa, e pelo AWS Shield, que mitiga </w:t>
-      </w:r>
-      <w:proofErr w:type="spellStart"/>
-      <w:r>
-        <w:t>DDoS</w:t>
-      </w:r>
-      <w:proofErr w:type="spellEnd"/>
-      <w:r>
-        <w:t xml:space="preserve"> na borda. O </w:t>
-      </w:r>
-      <w:proofErr w:type="spellStart"/>
-      <w:r>
-        <w:t>CloudFront</w:t>
-      </w:r>
-      <w:proofErr w:type="spellEnd"/>
-      <w:r>
-        <w:t xml:space="preserve"> encaminha o tráfego dinâmico para a EC2 do </w:t>
-      </w:r>
-      <w:proofErr w:type="spellStart"/>
-      <w:r>
-        <w:t>frontend</w:t>
-      </w:r>
-      <w:proofErr w:type="spellEnd"/>
-      <w:r>
-        <w:t xml:space="preserve"> e serve o conteúdo estático direto do S3. A EC2 consulta o RDS </w:t>
-      </w:r>
-      <w:proofErr w:type="spellStart"/>
-      <w:r>
-        <w:t>MariaDB</w:t>
-      </w:r>
-      <w:proofErr w:type="spellEnd"/>
-      <w:r>
-        <w:t xml:space="preserve"> pela porta 3306, dentro da rede privada. O usuário nunca alcança a EC2 ou o banco diretamente: o front só aceita conexões vindas do </w:t>
-      </w:r>
-      <w:proofErr w:type="spellStart"/>
-      <w:r>
-        <w:t>CloudFront</w:t>
-      </w:r>
-      <w:proofErr w:type="spellEnd"/>
-      <w:r>
-        <w:t>, e o banco só aceita conexões vindas do front.</w:t>
+        <w:t>O usuário acessa a URL do CloudFront. A requisição passa pelo AWS WAF, que filtra ataques comuns e aplica limite de taxa, e pelo AWS Shield, que mitiga DDoS na borda. O CloudFront encaminha o tráfego dinâmico para a EC2 do frontend e serve o conteúdo estático direto do S3. A EC2 consulta o RDS MariaDB pela porta 3306, dentro da rede privada. O usuário nunca alcança a EC2 ou o banco diretamente: o front só aceita conexões vindas do CloudFront, e o banco só aceita conexões vindas do front.</w:t>
       </w:r>
     </w:p>
     <w:p>
@@ -1644,47 +1147,7 @@
         <w:spacing w:after="140" w:line="276" w:lineRule="auto"/>
       </w:pPr>
       <w:r>
-        <w:t xml:space="preserve">A arquitetura final atende os </w:t>
-      </w:r>
-      <w:proofErr w:type="spellStart"/>
-      <w:r>
-        <w:t>SLOs</w:t>
-      </w:r>
-      <w:proofErr w:type="spellEnd"/>
-      <w:r>
-        <w:t xml:space="preserve"> definidos no roteiro move2cloud da Mercantis: disponibilidade de 99,9% ao mês, latência p95 menor ou igual a 300 </w:t>
-      </w:r>
-      <w:proofErr w:type="spellStart"/>
-      <w:r>
-        <w:t>ms</w:t>
-      </w:r>
-      <w:proofErr w:type="spellEnd"/>
-      <w:r>
-        <w:t xml:space="preserve"> no pico, RTO de até 1 hora e RPO de até 15 minutos. Ela distribui a aplicação por duas </w:t>
-      </w:r>
-      <w:proofErr w:type="spellStart"/>
-      <w:r>
-        <w:t>Availability</w:t>
-      </w:r>
-      <w:proofErr w:type="spellEnd"/>
-      <w:r>
-        <w:t xml:space="preserve"> Zones, com balanceador de carga, auto </w:t>
-      </w:r>
-      <w:proofErr w:type="spellStart"/>
-      <w:r>
-        <w:t>scaling</w:t>
-      </w:r>
-      <w:proofErr w:type="spellEnd"/>
-      <w:r>
-        <w:t xml:space="preserve"> e banco em </w:t>
-      </w:r>
-      <w:proofErr w:type="spellStart"/>
-      <w:r>
-        <w:t>Multi-AZ</w:t>
-      </w:r>
-      <w:proofErr w:type="spellEnd"/>
-      <w:r>
-        <w:t>.</w:t>
+        <w:t>A arquitetura final atende os SLOs definidos no roteiro move2cloud da Mercantis: disponibilidade de 99,9% ao mês, latência p95 menor ou igual a 300 ms no pico, RTO de até 1 hora e RPO de até 15 minutos. Ela distribui a aplicação por duas Availability Zones, com balanceador de carga, auto scaling e banco em Multi-AZ.</w:t>
       </w:r>
     </w:p>
     <w:p>
@@ -1697,7 +1160,7 @@
           <w:noProof/>
         </w:rPr>
         <w:drawing>
-          <wp:inline distT="0" distB="0" distL="0" distR="0" wp14:anchorId="1CA94798" wp14:editId="252C5AAD">
+          <wp:inline distT="0" distB="0" distL="0" distR="0" wp14:anchorId="2295DAFF" wp14:editId="69FF32BD">
             <wp:extent cx="5715000" cy="4171950"/>
             <wp:effectExtent l="0" t="0" r="0" b="0"/>
             <wp:docPr id="1" name="Diagrama da infraestrutura final da Mercantis" descr="Diagrama da infraestrutura final da Mercantis" title="Diagrama da infraestrutura final da Mercantis"/>
@@ -1749,73 +1212,7 @@
           <w:sz w:val="18"/>
           <w:szCs w:val="18"/>
         </w:rPr>
-        <w:t xml:space="preserve">Figura 1. Infraestrutura final (alvo) em duas </w:t>
-      </w:r>
-      <w:proofErr w:type="spellStart"/>
-      <w:r>
-        <w:rPr>
-          <w:i/>
-          <w:iCs/>
-          <w:color w:val="555555"/>
-          <w:sz w:val="18"/>
-          <w:szCs w:val="18"/>
-        </w:rPr>
-        <w:t>AZs</w:t>
-      </w:r>
-      <w:proofErr w:type="spellEnd"/>
-      <w:r>
-        <w:rPr>
-          <w:i/>
-          <w:iCs/>
-          <w:color w:val="555555"/>
-          <w:sz w:val="18"/>
-          <w:szCs w:val="18"/>
-        </w:rPr>
-        <w:t xml:space="preserve">, com ALB, auto </w:t>
-      </w:r>
-      <w:proofErr w:type="spellStart"/>
-      <w:r>
-        <w:rPr>
-          <w:i/>
-          <w:iCs/>
-          <w:color w:val="555555"/>
-          <w:sz w:val="18"/>
-          <w:szCs w:val="18"/>
-        </w:rPr>
-        <w:t>scaling</w:t>
-      </w:r>
-      <w:proofErr w:type="spellEnd"/>
-      <w:r>
-        <w:rPr>
-          <w:i/>
-          <w:iCs/>
-          <w:color w:val="555555"/>
-          <w:sz w:val="18"/>
-          <w:szCs w:val="18"/>
-        </w:rPr>
-        <w:t xml:space="preserve"> e RDS </w:t>
-      </w:r>
-      <w:proofErr w:type="spellStart"/>
-      <w:r>
-        <w:rPr>
-          <w:i/>
-          <w:iCs/>
-          <w:color w:val="555555"/>
-          <w:sz w:val="18"/>
-          <w:szCs w:val="18"/>
-        </w:rPr>
-        <w:t>Multi-AZ</w:t>
-      </w:r>
-      <w:proofErr w:type="spellEnd"/>
-      <w:r>
-        <w:rPr>
-          <w:i/>
-          <w:iCs/>
-          <w:color w:val="555555"/>
-          <w:sz w:val="18"/>
-          <w:szCs w:val="18"/>
-        </w:rPr>
-        <w:t>.</w:t>
+        <w:t>Figura 1. Infraestrutura final (alvo) em duas AZs, com ALB, auto scaling e RDS Multi-AZ.</w:t>
       </w:r>
     </w:p>
     <w:p>
@@ -1848,29 +1245,8 @@
         </w:numPr>
         <w:spacing w:after="80" w:line="268" w:lineRule="auto"/>
       </w:pPr>
-      <w:proofErr w:type="spellStart"/>
-      <w:r>
-        <w:t>CloudFront</w:t>
-      </w:r>
-      <w:proofErr w:type="spellEnd"/>
-      <w:r>
-        <w:t xml:space="preserve">, WAF e Shield </w:t>
-      </w:r>
-      <w:proofErr w:type="spellStart"/>
-      <w:r>
-        <w:t>Advanced</w:t>
-      </w:r>
-      <w:proofErr w:type="spellEnd"/>
-      <w:r>
-        <w:t xml:space="preserve"> na borda, com proteção </w:t>
-      </w:r>
-      <w:proofErr w:type="spellStart"/>
-      <w:r>
-        <w:t>DDoS</w:t>
-      </w:r>
-      <w:proofErr w:type="spellEnd"/>
-      <w:r>
-        <w:t xml:space="preserve"> reforçada.</w:t>
+      <w:r>
+        <w:t>CloudFront, WAF e Shield Advanced na borda, com proteção DDoS reforçada.</w:t>
       </w:r>
     </w:p>
     <w:p>
@@ -1882,37 +1258,8 @@
         </w:numPr>
         <w:spacing w:after="80" w:line="268" w:lineRule="auto"/>
       </w:pPr>
-      <w:proofErr w:type="spellStart"/>
-      <w:r>
-        <w:t>Application</w:t>
-      </w:r>
-      <w:proofErr w:type="spellEnd"/>
-      <w:r>
-        <w:t xml:space="preserve"> </w:t>
-      </w:r>
-      <w:proofErr w:type="spellStart"/>
-      <w:r>
-        <w:t>Load</w:t>
-      </w:r>
-      <w:proofErr w:type="spellEnd"/>
-      <w:r>
-        <w:t xml:space="preserve"> </w:t>
-      </w:r>
-      <w:proofErr w:type="spellStart"/>
-      <w:r>
-        <w:t>Balancer</w:t>
-      </w:r>
-      <w:proofErr w:type="spellEnd"/>
-      <w:r>
-        <w:t xml:space="preserve"> público distribuindo tráfego entre as duas </w:t>
-      </w:r>
-      <w:proofErr w:type="spellStart"/>
-      <w:r>
-        <w:t>AZs</w:t>
-      </w:r>
-      <w:proofErr w:type="spellEnd"/>
-      <w:r>
-        <w:t>.</w:t>
+      <w:r>
+        <w:t>Application Load Balancer público distribuindo tráfego entre as duas AZs.</w:t>
       </w:r>
     </w:p>
     <w:p>
@@ -1925,31 +1272,7 @@
         <w:spacing w:after="80" w:line="268" w:lineRule="auto"/>
       </w:pPr>
       <w:r>
-        <w:t xml:space="preserve">Camada de aplicação escalável (ECS ou EC2 em Auto </w:t>
-      </w:r>
-      <w:proofErr w:type="spellStart"/>
-      <w:r>
-        <w:t>Scaling</w:t>
-      </w:r>
-      <w:proofErr w:type="spellEnd"/>
-      <w:r>
-        <w:t xml:space="preserve"> </w:t>
-      </w:r>
-      <w:proofErr w:type="spellStart"/>
-      <w:r>
-        <w:t>Group</w:t>
-      </w:r>
-      <w:proofErr w:type="spellEnd"/>
-      <w:r>
-        <w:t xml:space="preserve">) em </w:t>
-      </w:r>
-      <w:proofErr w:type="spellStart"/>
-      <w:r>
-        <w:t>sub-redes</w:t>
-      </w:r>
-      <w:proofErr w:type="spellEnd"/>
-      <w:r>
-        <w:t xml:space="preserve"> privadas.</w:t>
+        <w:t>Camada de aplicação escalável (ECS ou EC2 em Auto Scaling Group) em sub-redes privadas.</w:t>
       </w:r>
     </w:p>
     <w:p>
@@ -1962,39 +1285,7 @@
         <w:spacing w:after="80" w:line="268" w:lineRule="auto"/>
       </w:pPr>
       <w:r>
-        <w:t xml:space="preserve">RDS </w:t>
-      </w:r>
-      <w:proofErr w:type="spellStart"/>
-      <w:r>
-        <w:t>MariaDB</w:t>
-      </w:r>
-      <w:proofErr w:type="spellEnd"/>
-      <w:r>
-        <w:t xml:space="preserve"> </w:t>
-      </w:r>
-      <w:proofErr w:type="spellStart"/>
-      <w:r>
-        <w:t>Multi-AZ</w:t>
-      </w:r>
-      <w:proofErr w:type="spellEnd"/>
-      <w:r>
-        <w:t xml:space="preserve">, com </w:t>
-      </w:r>
-      <w:proofErr w:type="gramStart"/>
-      <w:r>
-        <w:t>standby</w:t>
-      </w:r>
-      <w:proofErr w:type="gramEnd"/>
-      <w:r>
-        <w:t xml:space="preserve"> em outra AZ para </w:t>
-      </w:r>
-      <w:proofErr w:type="spellStart"/>
-      <w:r>
-        <w:t>failover</w:t>
-      </w:r>
-      <w:proofErr w:type="spellEnd"/>
-      <w:r>
-        <w:t xml:space="preserve"> automático e réplicas de leitura.</w:t>
+        <w:t>RDS MariaDB Multi-AZ, com standby em outra AZ para failover automático e réplicas de leitura.</w:t>
       </w:r>
     </w:p>
     <w:p>
@@ -2007,31 +1298,7 @@
         <w:spacing w:after="80" w:line="268" w:lineRule="auto"/>
       </w:pPr>
       <w:r>
-        <w:t xml:space="preserve">S3 para estáticos e logs, ECR para imagens Docker, </w:t>
-      </w:r>
-      <w:proofErr w:type="spellStart"/>
-      <w:r>
-        <w:t>GuardDuty</w:t>
-      </w:r>
-      <w:proofErr w:type="spellEnd"/>
-      <w:r>
-        <w:t xml:space="preserve"> e </w:t>
-      </w:r>
-      <w:proofErr w:type="spellStart"/>
-      <w:r>
-        <w:t>CloudWatch</w:t>
-      </w:r>
-      <w:proofErr w:type="spellEnd"/>
-      <w:r>
-        <w:t xml:space="preserve"> para detecção e </w:t>
-      </w:r>
-      <w:proofErr w:type="spellStart"/>
-      <w:r>
-        <w:t>observabilidade</w:t>
-      </w:r>
-      <w:proofErr w:type="spellEnd"/>
-      <w:r>
-        <w:t>.</w:t>
+        <w:t>S3 para estáticos e logs, ECR para imagens Docker, GuardDuty e CloudWatch para detecção e observabilidade.</w:t>
       </w:r>
     </w:p>
     <w:p>
@@ -2053,23 +1320,7 @@
         <w:spacing w:after="140" w:line="276" w:lineRule="auto"/>
       </w:pPr>
       <w:r>
-        <w:t xml:space="preserve">O MVP implementa o núcleo da arquitetura final com menos componentes, para validar segurança e funcionamento a custo baixo. A rede já nasce com duas </w:t>
-      </w:r>
-      <w:proofErr w:type="spellStart"/>
-      <w:r>
-        <w:t>AZs</w:t>
-      </w:r>
-      <w:proofErr w:type="spellEnd"/>
-      <w:r>
-        <w:t xml:space="preserve">, o que prepara o terreno para o </w:t>
-      </w:r>
-      <w:proofErr w:type="spellStart"/>
-      <w:r>
-        <w:t>Multi-AZ</w:t>
-      </w:r>
-      <w:proofErr w:type="spellEnd"/>
-      <w:r>
-        <w:t xml:space="preserve"> sem reescrever a infraestrutura.</w:t>
+        <w:t>O MVP implementa o núcleo da arquitetura final com menos componentes, para validar segurança e funcionamento a custo baixo. A rede já nasce com duas AZs, o que prepara o terreno para o Multi-AZ sem reescrever a infraestrutura.</w:t>
       </w:r>
     </w:p>
     <w:p>
@@ -2082,10 +1333,10 @@
           <w:noProof/>
         </w:rPr>
         <w:drawing>
-          <wp:inline distT="0" distB="0" distL="0" distR="0" wp14:anchorId="319F6B20" wp14:editId="4BDD8104">
+          <wp:inline distT="0" distB="0" distL="0" distR="0" wp14:anchorId="7E4A6F26" wp14:editId="0896F3A1">
             <wp:extent cx="5715000" cy="3952875"/>
             <wp:effectExtent l="0" t="0" r="0" b="0"/>
-            <wp:docPr id="1676425072" name="Diagrama da infraestrutura do MVP da Mercantis" descr="Diagrama da infraestrutura do MVP da Mercantis" title="Diagrama da infraestrutura do MVP da Mercantis"/>
+            <wp:docPr id="236455815" name="Diagrama da infraestrutura do MVP da Mercantis" descr="Diagrama da infraestrutura do MVP da Mercantis" title="Diagrama da infraestrutura do MVP da Mercantis"/>
             <wp:cNvGraphicFramePr>
               <a:graphicFrameLocks xmlns:a="http://schemas.openxmlformats.org/drawingml/2006/main" noChangeAspect="1"/>
             </wp:cNvGraphicFramePr>
@@ -2134,51 +1385,7 @@
           <w:sz w:val="18"/>
           <w:szCs w:val="18"/>
         </w:rPr>
-        <w:t xml:space="preserve">Figura 2. Infraestrutura do MVP: EC2 com Docker na </w:t>
-      </w:r>
-      <w:proofErr w:type="spellStart"/>
-      <w:r>
-        <w:rPr>
-          <w:i/>
-          <w:iCs/>
-          <w:color w:val="555555"/>
-          <w:sz w:val="18"/>
-          <w:szCs w:val="18"/>
-        </w:rPr>
-        <w:t>sub-rede</w:t>
-      </w:r>
-      <w:proofErr w:type="spellEnd"/>
-      <w:r>
-        <w:rPr>
-          <w:i/>
-          <w:iCs/>
-          <w:color w:val="555555"/>
-          <w:sz w:val="18"/>
-          <w:szCs w:val="18"/>
-        </w:rPr>
-        <w:t xml:space="preserve"> pública e RDS </w:t>
-      </w:r>
-      <w:proofErr w:type="spellStart"/>
-      <w:r>
-        <w:rPr>
-          <w:i/>
-          <w:iCs/>
-          <w:color w:val="555555"/>
-          <w:sz w:val="18"/>
-          <w:szCs w:val="18"/>
-        </w:rPr>
-        <w:t>MariaDB</w:t>
-      </w:r>
-      <w:proofErr w:type="spellEnd"/>
-      <w:r>
-        <w:rPr>
-          <w:i/>
-          <w:iCs/>
-          <w:color w:val="555555"/>
-          <w:sz w:val="18"/>
-          <w:szCs w:val="18"/>
-        </w:rPr>
-        <w:t xml:space="preserve"> na privada.</w:t>
+        <w:t>Figura 2. Infraestrutura do MVP: EC2 com Docker na sub-rede pública e RDS MariaDB na privada.</w:t>
       </w:r>
     </w:p>
     <w:p>
@@ -2199,23 +1406,7 @@
         <w:spacing w:after="80" w:line="268" w:lineRule="auto"/>
       </w:pPr>
       <w:r>
-        <w:t xml:space="preserve">VPC 10.0.0.0/16 com </w:t>
-      </w:r>
-      <w:proofErr w:type="spellStart"/>
-      <w:r>
-        <w:t>sub-redes</w:t>
-      </w:r>
-      <w:proofErr w:type="spellEnd"/>
-      <w:r>
-        <w:t xml:space="preserve"> pública e privada em duas </w:t>
-      </w:r>
-      <w:proofErr w:type="spellStart"/>
-      <w:r>
-        <w:t>AZs</w:t>
-      </w:r>
-      <w:proofErr w:type="spellEnd"/>
-      <w:r>
-        <w:t xml:space="preserve"> (sa-east-1).</w:t>
+        <w:t>VPC 10.0.0.0/16 com sub-redes pública e privada em duas AZs (sa-east-1).</w:t>
       </w:r>
     </w:p>
     <w:p>
@@ -2228,23 +1419,7 @@
         <w:spacing w:after="80" w:line="268" w:lineRule="auto"/>
       </w:pPr>
       <w:r>
-        <w:t xml:space="preserve">EC2 com Docker na </w:t>
-      </w:r>
-      <w:proofErr w:type="spellStart"/>
-      <w:r>
-        <w:t>sub-rede</w:t>
-      </w:r>
-      <w:proofErr w:type="spellEnd"/>
-      <w:r>
-        <w:t xml:space="preserve"> pública, executando o container do </w:t>
-      </w:r>
-      <w:proofErr w:type="spellStart"/>
-      <w:r>
-        <w:t>frontend</w:t>
-      </w:r>
-      <w:proofErr w:type="spellEnd"/>
-      <w:r>
-        <w:t>.</w:t>
+        <w:t>EC2 com Docker na sub-rede pública, executando o container do frontend.</w:t>
       </w:r>
     </w:p>
     <w:p>
@@ -2257,23 +1432,7 @@
         <w:spacing w:after="80" w:line="268" w:lineRule="auto"/>
       </w:pPr>
       <w:r>
-        <w:t xml:space="preserve">RDS </w:t>
-      </w:r>
-      <w:proofErr w:type="spellStart"/>
-      <w:r>
-        <w:t>MariaDB</w:t>
-      </w:r>
-      <w:proofErr w:type="spellEnd"/>
-      <w:r>
-        <w:t xml:space="preserve"> na </w:t>
-      </w:r>
-      <w:proofErr w:type="spellStart"/>
-      <w:r>
-        <w:t>sub-rede</w:t>
-      </w:r>
-      <w:proofErr w:type="spellEnd"/>
-      <w:r>
-        <w:t xml:space="preserve"> privada, sem acesso público.</w:t>
+        <w:t>RDS MariaDB na sub-rede privada, sem acesso público.</w:t>
       </w:r>
     </w:p>
     <w:p>
@@ -2285,13 +1444,8 @@
         </w:numPr>
         <w:spacing w:after="80" w:line="268" w:lineRule="auto"/>
       </w:pPr>
-      <w:proofErr w:type="spellStart"/>
-      <w:r>
-        <w:t>CloudFront</w:t>
-      </w:r>
-      <w:proofErr w:type="spellEnd"/>
-      <w:r>
-        <w:t xml:space="preserve"> com AWS WAF e AWS Shield Standard na borda.</w:t>
+      <w:r>
+        <w:t>CloudFront com AWS WAF e AWS Shield Standard na borda.</w:t>
       </w:r>
     </w:p>
     <w:p>
@@ -2303,37 +1457,8 @@
         </w:numPr>
         <w:spacing w:after="80" w:line="268" w:lineRule="auto"/>
       </w:pPr>
-      <w:proofErr w:type="spellStart"/>
-      <w:r>
-        <w:t>Bucket</w:t>
-      </w:r>
-      <w:proofErr w:type="spellEnd"/>
-      <w:r>
-        <w:t xml:space="preserve"> S3 privado para estáticos, servido pelo </w:t>
-      </w:r>
-      <w:proofErr w:type="spellStart"/>
-      <w:r>
-        <w:t>CloudFront</w:t>
-      </w:r>
-      <w:proofErr w:type="spellEnd"/>
-      <w:r>
-        <w:t xml:space="preserve"> via </w:t>
-      </w:r>
-      <w:proofErr w:type="spellStart"/>
-      <w:r>
-        <w:t>Origin</w:t>
-      </w:r>
-      <w:proofErr w:type="spellEnd"/>
-      <w:r>
-        <w:t xml:space="preserve"> Access </w:t>
-      </w:r>
-      <w:proofErr w:type="spellStart"/>
-      <w:r>
-        <w:t>Control</w:t>
-      </w:r>
-      <w:proofErr w:type="spellEnd"/>
-      <w:r>
-        <w:t>.</w:t>
+      <w:r>
+        <w:t>Bucket S3 privado para estáticos, servido pelo CloudFront via Origin Access Control.</w:t>
       </w:r>
     </w:p>
     <w:p>
@@ -2346,15 +1471,7 @@
         <w:spacing w:after="80" w:line="268" w:lineRule="auto"/>
       </w:pPr>
       <w:r>
-        <w:t xml:space="preserve">Internet Gateway para a </w:t>
-      </w:r>
-      <w:proofErr w:type="spellStart"/>
-      <w:r>
-        <w:t>sub-rede</w:t>
-      </w:r>
-      <w:proofErr w:type="spellEnd"/>
-      <w:r>
-        <w:t xml:space="preserve"> pública e NAT Gateway para a saída controlada da privada.</w:t>
+        <w:t>Internet Gateway para a sub-rede pública. A sub-rede privada não tem rota para a internet, o que mantém o banco isolado.</w:t>
       </w:r>
     </w:p>
     <w:p>
@@ -2367,15 +1484,7 @@
         <w:spacing w:after="80" w:line="268" w:lineRule="auto"/>
       </w:pPr>
       <w:r>
-        <w:t xml:space="preserve">Secrets Manager com KMS para as credenciais do banco, e VPC Flow Logs no </w:t>
-      </w:r>
-      <w:proofErr w:type="spellStart"/>
-      <w:r>
-        <w:t>CloudWatch</w:t>
-      </w:r>
-      <w:proofErr w:type="spellEnd"/>
-      <w:r>
-        <w:t>.</w:t>
+        <w:t>Secrets Manager com KMS para as credenciais do banco, e VPC Flow Logs no CloudWatch.</w:t>
       </w:r>
     </w:p>
     <w:p>
@@ -2401,7 +1510,7 @@
           <w:left w:w="10" w:type="dxa"/>
           <w:right w:w="10" w:type="dxa"/>
         </w:tblCellMar>
-        <w:tblLook w:val="04A0" w:firstRow="1" w:lastRow="0" w:firstColumn="1" w:lastColumn="0" w:noHBand="0" w:noVBand="1"/>
+        <w:tblLook w:val="0000" w:firstRow="0" w:lastRow="0" w:firstColumn="0" w:lastColumn="0" w:noHBand="0" w:noVBand="0"/>
       </w:tblPr>
       <w:tblGrid>
         <w:gridCol w:w="2600"/>
@@ -2498,23 +1607,13 @@
             <w:pPr>
               <w:spacing w:line="252" w:lineRule="auto"/>
             </w:pPr>
-            <w:proofErr w:type="spellStart"/>
-            <w:r>
-              <w:rPr>
-                <w:color w:val="111111"/>
-                <w:sz w:val="19"/>
-                <w:szCs w:val="19"/>
-              </w:rPr>
-              <w:t>Frontend</w:t>
-            </w:r>
-            <w:proofErr w:type="spellEnd"/>
-            <w:r>
-              <w:rPr>
-                <w:color w:val="111111"/>
-                <w:sz w:val="19"/>
-                <w:szCs w:val="19"/>
-              </w:rPr>
-              <w:t xml:space="preserve"> em EC2 + Docker</w:t>
+            <w:r>
+              <w:rPr>
+                <w:color w:val="111111"/>
+                <w:sz w:val="19"/>
+                <w:szCs w:val="19"/>
+              </w:rPr>
+              <w:t>Frontend em EC2 + Docker</w:t>
             </w:r>
           </w:p>
         </w:tc>
@@ -2540,43 +1639,7 @@
                 <w:sz w:val="19"/>
                 <w:szCs w:val="19"/>
               </w:rPr>
-              <w:t xml:space="preserve">Atende o requisito de container e mantém fidelidade ao ícone de EC2 do diagrama-base. </w:t>
-            </w:r>
-            <w:proofErr w:type="spellStart"/>
-            <w:r>
-              <w:rPr>
-                <w:color w:val="111111"/>
-                <w:sz w:val="19"/>
-                <w:szCs w:val="19"/>
-              </w:rPr>
-              <w:t>Conteineriza</w:t>
-            </w:r>
-            <w:proofErr w:type="spellEnd"/>
-            <w:r>
-              <w:rPr>
-                <w:color w:val="111111"/>
-                <w:sz w:val="19"/>
-                <w:szCs w:val="19"/>
-              </w:rPr>
-              <w:t xml:space="preserve"> a aplicação (</w:t>
-            </w:r>
-            <w:proofErr w:type="spellStart"/>
-            <w:r>
-              <w:rPr>
-                <w:color w:val="111111"/>
-                <w:sz w:val="19"/>
-                <w:szCs w:val="19"/>
-              </w:rPr>
-              <w:t>refactor</w:t>
-            </w:r>
-            <w:proofErr w:type="spellEnd"/>
-            <w:r>
-              <w:rPr>
-                <w:color w:val="111111"/>
-                <w:sz w:val="19"/>
-                <w:szCs w:val="19"/>
-              </w:rPr>
-              <w:t xml:space="preserve"> leve) sem o custo operacional de um cluster no MVP.</w:t>
+              <w:t>Atende o requisito de container e mantém fidelidade ao ícone de EC2 do diagrama-base. Conteineriza a aplicação (refactor leve) sem o custo operacional de um cluster no MVP.</w:t>
             </w:r>
           </w:p>
         </w:tc>
@@ -2610,25 +1673,7 @@
                 <w:sz w:val="19"/>
                 <w:szCs w:val="19"/>
               </w:rPr>
-              <w:t xml:space="preserve">Banco em RDS </w:t>
-            </w:r>
-            <w:proofErr w:type="spellStart"/>
-            <w:r>
-              <w:rPr>
-                <w:color w:val="111111"/>
-                <w:sz w:val="19"/>
-                <w:szCs w:val="19"/>
-              </w:rPr>
-              <w:t>MariaDB</w:t>
-            </w:r>
-            <w:proofErr w:type="spellEnd"/>
-            <w:r>
-              <w:rPr>
-                <w:color w:val="111111"/>
-                <w:sz w:val="19"/>
-                <w:szCs w:val="19"/>
-              </w:rPr>
-              <w:t xml:space="preserve"> gerenciado</w:t>
+              <w:t>Banco em RDS MariaDB gerenciado</w:t>
             </w:r>
           </w:p>
         </w:tc>
@@ -2654,61 +1699,7 @@
                 <w:sz w:val="19"/>
                 <w:szCs w:val="19"/>
               </w:rPr>
-              <w:t xml:space="preserve">Estratégia </w:t>
-            </w:r>
-            <w:proofErr w:type="spellStart"/>
-            <w:r>
-              <w:rPr>
-                <w:color w:val="111111"/>
-                <w:sz w:val="19"/>
-                <w:szCs w:val="19"/>
-              </w:rPr>
-              <w:t>replatform</w:t>
-            </w:r>
-            <w:proofErr w:type="spellEnd"/>
-            <w:r>
-              <w:rPr>
-                <w:color w:val="111111"/>
-                <w:sz w:val="19"/>
-                <w:szCs w:val="19"/>
-              </w:rPr>
-              <w:t xml:space="preserve">: a AWS cuida de backup, patch e </w:t>
-            </w:r>
-            <w:proofErr w:type="spellStart"/>
-            <w:r>
-              <w:rPr>
-                <w:color w:val="111111"/>
-                <w:sz w:val="19"/>
-                <w:szCs w:val="19"/>
-              </w:rPr>
-              <w:t>failover</w:t>
-            </w:r>
-            <w:proofErr w:type="spellEnd"/>
-            <w:r>
-              <w:rPr>
-                <w:color w:val="111111"/>
-                <w:sz w:val="19"/>
-                <w:szCs w:val="19"/>
-              </w:rPr>
-              <w:t xml:space="preserve">. Resolve o servidor de banco </w:t>
-            </w:r>
-            <w:proofErr w:type="spellStart"/>
-            <w:r>
-              <w:rPr>
-                <w:color w:val="111111"/>
-                <w:sz w:val="19"/>
-                <w:szCs w:val="19"/>
-              </w:rPr>
-              <w:t>on-premises</w:t>
-            </w:r>
-            <w:proofErr w:type="spellEnd"/>
-            <w:r>
-              <w:rPr>
-                <w:color w:val="111111"/>
-                <w:sz w:val="19"/>
-                <w:szCs w:val="19"/>
-              </w:rPr>
-              <w:t xml:space="preserve"> exposto e sem redundância.</w:t>
+              <w:t>Estratégia replatform: a AWS cuida de backup, patch e failover. Resolve o servidor de banco on-premises exposto e sem redundância.</w:t>
             </w:r>
           </w:p>
         </w:tc>
@@ -2802,25 +1793,7 @@
                 <w:sz w:val="19"/>
                 <w:szCs w:val="19"/>
               </w:rPr>
-              <w:t xml:space="preserve">Banco em </w:t>
-            </w:r>
-            <w:proofErr w:type="spellStart"/>
-            <w:r>
-              <w:rPr>
-                <w:color w:val="111111"/>
-                <w:sz w:val="19"/>
-                <w:szCs w:val="19"/>
-              </w:rPr>
-              <w:t>sub-rede</w:t>
-            </w:r>
-            <w:proofErr w:type="spellEnd"/>
-            <w:r>
-              <w:rPr>
-                <w:color w:val="111111"/>
-                <w:sz w:val="19"/>
-                <w:szCs w:val="19"/>
-              </w:rPr>
-              <w:t xml:space="preserve"> privada</w:t>
+              <w:t>Banco em sub-rede privada</w:t>
             </w:r>
           </w:p>
         </w:tc>
@@ -2846,25 +1819,7 @@
                 <w:sz w:val="19"/>
                 <w:szCs w:val="19"/>
               </w:rPr>
-              <w:t xml:space="preserve">Elimina o problema do banco em segmento público </w:t>
-            </w:r>
-            <w:proofErr w:type="spellStart"/>
-            <w:r>
-              <w:rPr>
-                <w:color w:val="111111"/>
-                <w:sz w:val="19"/>
-                <w:szCs w:val="19"/>
-              </w:rPr>
-              <w:t>on-premises</w:t>
-            </w:r>
-            <w:proofErr w:type="spellEnd"/>
-            <w:r>
-              <w:rPr>
-                <w:color w:val="111111"/>
-                <w:sz w:val="19"/>
-                <w:szCs w:val="19"/>
-              </w:rPr>
-              <w:t xml:space="preserve"> e bloqueia o movimento lateral entre web e dados.</w:t>
+              <w:t>Elimina o problema do banco em segmento público on-premises e bloqueia o movimento lateral entre web e dados.</w:t>
             </w:r>
           </w:p>
         </w:tc>
@@ -2892,23 +1847,13 @@
             <w:pPr>
               <w:spacing w:line="252" w:lineRule="auto"/>
             </w:pPr>
-            <w:proofErr w:type="spellStart"/>
-            <w:r>
-              <w:rPr>
-                <w:color w:val="111111"/>
-                <w:sz w:val="19"/>
-                <w:szCs w:val="19"/>
-              </w:rPr>
-              <w:t>CloudFront</w:t>
-            </w:r>
-            <w:proofErr w:type="spellEnd"/>
-            <w:r>
-              <w:rPr>
-                <w:color w:val="111111"/>
-                <w:sz w:val="19"/>
-                <w:szCs w:val="19"/>
-              </w:rPr>
-              <w:t xml:space="preserve"> + WAF + Shield</w:t>
+            <w:r>
+              <w:rPr>
+                <w:color w:val="111111"/>
+                <w:sz w:val="19"/>
+                <w:szCs w:val="19"/>
+              </w:rPr>
+              <w:t>CloudFront + WAF + Shield</w:t>
             </w:r>
           </w:p>
         </w:tc>
@@ -2968,25 +1913,7 @@
                 <w:sz w:val="19"/>
                 <w:szCs w:val="19"/>
               </w:rPr>
-              <w:t xml:space="preserve">Duas </w:t>
-            </w:r>
-            <w:proofErr w:type="spellStart"/>
-            <w:r>
-              <w:rPr>
-                <w:color w:val="111111"/>
-                <w:sz w:val="19"/>
-                <w:szCs w:val="19"/>
-              </w:rPr>
-              <w:t>AZs</w:t>
-            </w:r>
-            <w:proofErr w:type="spellEnd"/>
-            <w:r>
-              <w:rPr>
-                <w:color w:val="111111"/>
-                <w:sz w:val="19"/>
-                <w:szCs w:val="19"/>
-              </w:rPr>
-              <w:t xml:space="preserve"> na rede desde o MVP</w:t>
+              <w:t>Duas AZs na rede desde o MVP</w:t>
             </w:r>
           </w:p>
         </w:tc>
@@ -3012,61 +1939,7 @@
                 <w:sz w:val="19"/>
                 <w:szCs w:val="19"/>
               </w:rPr>
-              <w:t xml:space="preserve">Exigência do DB </w:t>
-            </w:r>
-            <w:proofErr w:type="spellStart"/>
-            <w:r>
-              <w:rPr>
-                <w:color w:val="111111"/>
-                <w:sz w:val="19"/>
-                <w:szCs w:val="19"/>
-              </w:rPr>
-              <w:t>Subnet</w:t>
-            </w:r>
-            <w:proofErr w:type="spellEnd"/>
-            <w:r>
-              <w:rPr>
-                <w:color w:val="111111"/>
-                <w:sz w:val="19"/>
-                <w:szCs w:val="19"/>
-              </w:rPr>
-              <w:t xml:space="preserve"> </w:t>
-            </w:r>
-            <w:proofErr w:type="spellStart"/>
-            <w:r>
-              <w:rPr>
-                <w:color w:val="111111"/>
-                <w:sz w:val="19"/>
-                <w:szCs w:val="19"/>
-              </w:rPr>
-              <w:t>Group</w:t>
-            </w:r>
-            <w:proofErr w:type="spellEnd"/>
-            <w:r>
-              <w:rPr>
-                <w:color w:val="111111"/>
-                <w:sz w:val="19"/>
-                <w:szCs w:val="19"/>
-              </w:rPr>
-              <w:t xml:space="preserve"> e base para o </w:t>
-            </w:r>
-            <w:proofErr w:type="spellStart"/>
-            <w:r>
-              <w:rPr>
-                <w:color w:val="111111"/>
-                <w:sz w:val="19"/>
-                <w:szCs w:val="19"/>
-              </w:rPr>
-              <w:t>Multi-AZ</w:t>
-            </w:r>
-            <w:proofErr w:type="spellEnd"/>
-            <w:r>
-              <w:rPr>
-                <w:color w:val="111111"/>
-                <w:sz w:val="19"/>
-                <w:szCs w:val="19"/>
-              </w:rPr>
-              <w:t xml:space="preserve"> da arquitetura final, sem retrabalho.</w:t>
+              <w:t>Exigência do DB Subnet Group e base para o Multi-AZ da arquitetura final, sem retrabalho.</w:t>
             </w:r>
           </w:p>
         </w:tc>
@@ -3123,108 +1996,7 @@
         <w:spacing w:after="140" w:line="276" w:lineRule="auto"/>
       </w:pPr>
       <w:r>
-        <w:t xml:space="preserve">Os Security Groups são o firewall </w:t>
-      </w:r>
-      <w:proofErr w:type="spellStart"/>
-      <w:r>
-        <w:t>stateful</w:t>
-      </w:r>
-      <w:proofErr w:type="spellEnd"/>
-      <w:r>
-        <w:t xml:space="preserve"> em nível de instância. Duas regras de ouro orientam o MVP: o </w:t>
-      </w:r>
-      <w:proofErr w:type="spellStart"/>
-      <w:r>
-        <w:t>frontend</w:t>
-      </w:r>
-      <w:proofErr w:type="spellEnd"/>
-      <w:r>
-        <w:t xml:space="preserve"> só aceita tráfego do </w:t>
-      </w:r>
-      <w:proofErr w:type="spellStart"/>
-      <w:r>
-        <w:t>CloudFront</w:t>
-      </w:r>
-      <w:proofErr w:type="spellEnd"/>
-      <w:r>
-        <w:t xml:space="preserve">, e o banco só aceita tráfego do </w:t>
-      </w:r>
-      <w:proofErr w:type="spellStart"/>
-      <w:r>
-        <w:t>frontend</w:t>
-      </w:r>
-      <w:proofErr w:type="spellEnd"/>
-      <w:r>
-        <w:t xml:space="preserve">. Em vez de liberar a porta 80 para a internet inteira, a regra de entrada do </w:t>
-      </w:r>
-      <w:proofErr w:type="spellStart"/>
-      <w:r>
-        <w:t>frontend</w:t>
-      </w:r>
-      <w:proofErr w:type="spellEnd"/>
-      <w:r>
-        <w:t xml:space="preserve"> usa a </w:t>
-      </w:r>
-      <w:proofErr w:type="spellStart"/>
-      <w:r>
-        <w:t>prefix</w:t>
-      </w:r>
-      <w:proofErr w:type="spellEnd"/>
-      <w:r>
-        <w:t xml:space="preserve"> </w:t>
-      </w:r>
-      <w:proofErr w:type="spellStart"/>
-      <w:r>
-        <w:t>list</w:t>
-      </w:r>
-      <w:proofErr w:type="spellEnd"/>
-      <w:r>
-        <w:t xml:space="preserve"> gerenciada do </w:t>
-      </w:r>
-      <w:proofErr w:type="spellStart"/>
-      <w:r>
-        <w:t>CloudFront</w:t>
-      </w:r>
-      <w:proofErr w:type="spellEnd"/>
-      <w:r>
-        <w:t xml:space="preserve"> (</w:t>
-      </w:r>
-      <w:proofErr w:type="spellStart"/>
-      <w:proofErr w:type="gramStart"/>
-      <w:r>
-        <w:t>com.amazonaws</w:t>
-      </w:r>
-      <w:proofErr w:type="gramEnd"/>
-      <w:r>
-        <w:t>.</w:t>
-      </w:r>
-      <w:proofErr w:type="gramStart"/>
-      <w:r>
-        <w:t>global.cloudfront</w:t>
-      </w:r>
-      <w:proofErr w:type="gramEnd"/>
-      <w:r>
-        <w:t>.origin-facing</w:t>
-      </w:r>
-      <w:proofErr w:type="spellEnd"/>
-      <w:r>
-        <w:t xml:space="preserve">), de modo que somente os </w:t>
-      </w:r>
-      <w:proofErr w:type="spellStart"/>
-      <w:r>
-        <w:t>IPs</w:t>
-      </w:r>
-      <w:proofErr w:type="spellEnd"/>
-      <w:r>
-        <w:t xml:space="preserve"> de origem do </w:t>
-      </w:r>
-      <w:proofErr w:type="spellStart"/>
-      <w:r>
-        <w:t>CloudFront</w:t>
-      </w:r>
-      <w:proofErr w:type="spellEnd"/>
-      <w:r>
-        <w:t xml:space="preserve"> alcançam a EC2.</w:t>
+        <w:t>Os Security Groups são o firewall stateful em nível de instância. Duas regras de ouro orientam o MVP: o frontend só aceita tráfego do CloudFront, e o banco só aceita tráfego do frontend. Em vez de liberar a porta 80 para a internet inteira, a regra de entrada do frontend usa a prefix list gerenciada do CloudFront (com.amazonaws.global.cloudfront.origin-facing), de modo que somente os IPs de origem do CloudFront alcançam a EC2.</w:t>
       </w:r>
     </w:p>
     <w:p>
@@ -3232,15 +2004,7 @@
         <w:pStyle w:val="Ttulo3"/>
       </w:pPr>
       <w:r>
-        <w:t xml:space="preserve">SG do </w:t>
-      </w:r>
-      <w:proofErr w:type="spellStart"/>
-      <w:r>
-        <w:t>frontend</w:t>
-      </w:r>
-      <w:proofErr w:type="spellEnd"/>
-      <w:r>
-        <w:t xml:space="preserve"> (EC2)</w:t>
+        <w:t>SG do frontend (EC2)</w:t>
       </w:r>
     </w:p>
     <w:tbl>
@@ -3258,7 +2022,7 @@
           <w:left w:w="10" w:type="dxa"/>
           <w:right w:w="10" w:type="dxa"/>
         </w:tblCellMar>
-        <w:tblLook w:val="04A0" w:firstRow="1" w:lastRow="0" w:firstColumn="1" w:lastColumn="0" w:noHBand="0" w:noVBand="1"/>
+        <w:tblLook w:val="0000" w:firstRow="0" w:lastRow="0" w:firstColumn="0" w:lastColumn="0" w:noHBand="0" w:noVBand="0"/>
       </w:tblPr>
       <w:tblGrid>
         <w:gridCol w:w="1500"/>
@@ -3464,52 +2228,14 @@
             <w:pPr>
               <w:spacing w:line="252" w:lineRule="auto"/>
             </w:pPr>
-            <w:proofErr w:type="spellStart"/>
-            <w:r>
-              <w:rPr>
-                <w:color w:val="111111"/>
-                <w:sz w:val="19"/>
-                <w:szCs w:val="19"/>
-              </w:rPr>
-              <w:t>Prefix</w:t>
-            </w:r>
-            <w:proofErr w:type="spellEnd"/>
-            <w:r>
-              <w:rPr>
-                <w:color w:val="111111"/>
-                <w:sz w:val="19"/>
-                <w:szCs w:val="19"/>
-              </w:rPr>
-              <w:t xml:space="preserve"> </w:t>
-            </w:r>
-            <w:proofErr w:type="spellStart"/>
-            <w:r>
-              <w:rPr>
-                <w:color w:val="111111"/>
-                <w:sz w:val="19"/>
-                <w:szCs w:val="19"/>
-              </w:rPr>
-              <w:t>list</w:t>
-            </w:r>
-            <w:proofErr w:type="spellEnd"/>
-            <w:r>
-              <w:rPr>
-                <w:color w:val="111111"/>
-                <w:sz w:val="19"/>
-                <w:szCs w:val="19"/>
-              </w:rPr>
-              <w:t xml:space="preserve"> do </w:t>
-            </w:r>
-            <w:proofErr w:type="spellStart"/>
-            <w:r>
-              <w:rPr>
-                <w:color w:val="111111"/>
-                <w:sz w:val="19"/>
-                <w:szCs w:val="19"/>
-              </w:rPr>
-              <w:t>CloudFront</w:t>
-            </w:r>
-            <w:proofErr w:type="spellEnd"/>
+            <w:r>
+              <w:rPr>
+                <w:color w:val="111111"/>
+                <w:sz w:val="19"/>
+                <w:szCs w:val="19"/>
+              </w:rPr>
+              <w:t>Prefix list do CloudFront</w:t>
+            </w:r>
           </w:p>
         </w:tc>
         <w:tc>
@@ -3534,18 +2260,8 @@
                 <w:sz w:val="19"/>
                 <w:szCs w:val="19"/>
               </w:rPr>
-              <w:t xml:space="preserve">HTTP somente do </w:t>
-            </w:r>
-            <w:proofErr w:type="spellStart"/>
-            <w:r>
-              <w:rPr>
-                <w:color w:val="111111"/>
-                <w:sz w:val="19"/>
-                <w:szCs w:val="19"/>
-              </w:rPr>
-              <w:t>CloudFront</w:t>
-            </w:r>
-            <w:proofErr w:type="spellEnd"/>
+              <w:t>HTTP somente do CloudFront</w:t>
+            </w:r>
           </w:p>
         </w:tc>
       </w:tr>
@@ -3624,52 +2340,14 @@
             <w:pPr>
               <w:spacing w:line="252" w:lineRule="auto"/>
             </w:pPr>
-            <w:proofErr w:type="spellStart"/>
-            <w:r>
-              <w:rPr>
-                <w:color w:val="111111"/>
-                <w:sz w:val="19"/>
-                <w:szCs w:val="19"/>
-              </w:rPr>
-              <w:t>Prefix</w:t>
-            </w:r>
-            <w:proofErr w:type="spellEnd"/>
-            <w:r>
-              <w:rPr>
-                <w:color w:val="111111"/>
-                <w:sz w:val="19"/>
-                <w:szCs w:val="19"/>
-              </w:rPr>
-              <w:t xml:space="preserve"> </w:t>
-            </w:r>
-            <w:proofErr w:type="spellStart"/>
-            <w:r>
-              <w:rPr>
-                <w:color w:val="111111"/>
-                <w:sz w:val="19"/>
-                <w:szCs w:val="19"/>
-              </w:rPr>
-              <w:t>list</w:t>
-            </w:r>
-            <w:proofErr w:type="spellEnd"/>
-            <w:r>
-              <w:rPr>
-                <w:color w:val="111111"/>
-                <w:sz w:val="19"/>
-                <w:szCs w:val="19"/>
-              </w:rPr>
-              <w:t xml:space="preserve"> do </w:t>
-            </w:r>
-            <w:proofErr w:type="spellStart"/>
-            <w:r>
-              <w:rPr>
-                <w:color w:val="111111"/>
-                <w:sz w:val="19"/>
-                <w:szCs w:val="19"/>
-              </w:rPr>
-              <w:t>CloudFront</w:t>
-            </w:r>
-            <w:proofErr w:type="spellEnd"/>
+            <w:r>
+              <w:rPr>
+                <w:color w:val="111111"/>
+                <w:sz w:val="19"/>
+                <w:szCs w:val="19"/>
+              </w:rPr>
+              <w:t>Prefix list do CloudFront</w:t>
+            </w:r>
           </w:p>
         </w:tc>
         <w:tc>
@@ -3694,18 +2372,8 @@
                 <w:sz w:val="19"/>
                 <w:szCs w:val="19"/>
               </w:rPr>
-              <w:t xml:space="preserve">HTTPS somente do </w:t>
-            </w:r>
-            <w:proofErr w:type="spellStart"/>
-            <w:r>
-              <w:rPr>
-                <w:color w:val="111111"/>
-                <w:sz w:val="19"/>
-                <w:szCs w:val="19"/>
-              </w:rPr>
-              <w:t>CloudFront</w:t>
-            </w:r>
-            <w:proofErr w:type="spellEnd"/>
+              <w:t>HTTPS somente do CloudFront</w:t>
+            </w:r>
           </w:p>
         </w:tc>
       </w:tr>
@@ -3835,51 +2503,7 @@
           <w:sz w:val="18"/>
           <w:szCs w:val="18"/>
         </w:rPr>
-        <w:t xml:space="preserve">Tabela 3. Regras do Security </w:t>
-      </w:r>
-      <w:proofErr w:type="spellStart"/>
-      <w:r>
-        <w:rPr>
-          <w:i/>
-          <w:iCs/>
-          <w:color w:val="555555"/>
-          <w:sz w:val="18"/>
-          <w:szCs w:val="18"/>
-        </w:rPr>
-        <w:t>Group</w:t>
-      </w:r>
-      <w:proofErr w:type="spellEnd"/>
-      <w:r>
-        <w:rPr>
-          <w:i/>
-          <w:iCs/>
-          <w:color w:val="555555"/>
-          <w:sz w:val="18"/>
-          <w:szCs w:val="18"/>
-        </w:rPr>
-        <w:t xml:space="preserve"> do </w:t>
-      </w:r>
-      <w:proofErr w:type="spellStart"/>
-      <w:r>
-        <w:rPr>
-          <w:i/>
-          <w:iCs/>
-          <w:color w:val="555555"/>
-          <w:sz w:val="18"/>
-          <w:szCs w:val="18"/>
-        </w:rPr>
-        <w:t>frontend</w:t>
-      </w:r>
-      <w:proofErr w:type="spellEnd"/>
-      <w:r>
-        <w:rPr>
-          <w:i/>
-          <w:iCs/>
-          <w:color w:val="555555"/>
-          <w:sz w:val="18"/>
-          <w:szCs w:val="18"/>
-        </w:rPr>
-        <w:t>. Não há porta 22 (SSH).</w:t>
+        <w:t>Tabela 3. Regras do Security Group do frontend. Não há porta 22 (SSH).</w:t>
       </w:r>
     </w:p>
     <w:p>
@@ -3887,15 +2511,7 @@
         <w:pStyle w:val="Ttulo3"/>
       </w:pPr>
       <w:r>
-        <w:t xml:space="preserve">SG do banco de dados (RDS </w:t>
-      </w:r>
-      <w:proofErr w:type="spellStart"/>
-      <w:r>
-        <w:t>MariaDB</w:t>
-      </w:r>
-      <w:proofErr w:type="spellEnd"/>
-      <w:r>
-        <w:t>)</w:t>
+        <w:t>SG do banco de dados (RDS MariaDB)</w:t>
       </w:r>
     </w:p>
     <w:tbl>
@@ -3913,7 +2529,7 @@
           <w:left w:w="10" w:type="dxa"/>
           <w:right w:w="10" w:type="dxa"/>
         </w:tblCellMar>
-        <w:tblLook w:val="04A0" w:firstRow="1" w:lastRow="0" w:firstColumn="1" w:lastColumn="0" w:noHBand="0" w:noVBand="1"/>
+        <w:tblLook w:val="0000" w:firstRow="0" w:lastRow="0" w:firstColumn="0" w:lastColumn="0" w:noHBand="0" w:noVBand="0"/>
       </w:tblPr>
       <w:tblGrid>
         <w:gridCol w:w="1500"/>
@@ -4125,25 +2741,7 @@
                 <w:sz w:val="19"/>
                 <w:szCs w:val="19"/>
               </w:rPr>
-              <w:t xml:space="preserve">SG do </w:t>
-            </w:r>
-            <w:proofErr w:type="spellStart"/>
-            <w:r>
-              <w:rPr>
-                <w:color w:val="111111"/>
-                <w:sz w:val="19"/>
-                <w:szCs w:val="19"/>
-              </w:rPr>
-              <w:t>frontend</w:t>
-            </w:r>
-            <w:proofErr w:type="spellEnd"/>
-            <w:r>
-              <w:rPr>
-                <w:color w:val="111111"/>
-                <w:sz w:val="19"/>
-                <w:szCs w:val="19"/>
-              </w:rPr>
-              <w:t xml:space="preserve"> (referência)</w:t>
+              <w:t>SG do frontend (referência)</w:t>
             </w:r>
           </w:p>
         </w:tc>
@@ -4163,34 +2761,14 @@
             <w:pPr>
               <w:spacing w:line="252" w:lineRule="auto"/>
             </w:pPr>
-            <w:proofErr w:type="spellStart"/>
-            <w:r>
-              <w:rPr>
-                <w:color w:val="111111"/>
-                <w:sz w:val="19"/>
-                <w:szCs w:val="19"/>
-              </w:rPr>
-              <w:t>MariaDB</w:t>
-            </w:r>
-            <w:proofErr w:type="spellEnd"/>
-            <w:r>
-              <w:rPr>
-                <w:color w:val="111111"/>
-                <w:sz w:val="19"/>
-                <w:szCs w:val="19"/>
-              </w:rPr>
-              <w:t xml:space="preserve"> apenas a partir do </w:t>
-            </w:r>
-            <w:proofErr w:type="spellStart"/>
-            <w:r>
-              <w:rPr>
-                <w:color w:val="111111"/>
-                <w:sz w:val="19"/>
-                <w:szCs w:val="19"/>
-              </w:rPr>
-              <w:t>frontend</w:t>
-            </w:r>
-            <w:proofErr w:type="spellEnd"/>
+            <w:r>
+              <w:rPr>
+                <w:color w:val="111111"/>
+                <w:sz w:val="19"/>
+                <w:szCs w:val="19"/>
+              </w:rPr>
+              <w:t>MariaDB apenas a partir do frontend</w:t>
+            </w:r>
           </w:p>
         </w:tc>
       </w:tr>
@@ -4320,29 +2898,7 @@
           <w:sz w:val="18"/>
           <w:szCs w:val="18"/>
         </w:rPr>
-        <w:t xml:space="preserve">Tabela 4. Regras do Security </w:t>
-      </w:r>
-      <w:proofErr w:type="spellStart"/>
-      <w:r>
-        <w:rPr>
-          <w:i/>
-          <w:iCs/>
-          <w:color w:val="555555"/>
-          <w:sz w:val="18"/>
-          <w:szCs w:val="18"/>
-        </w:rPr>
-        <w:t>Group</w:t>
-      </w:r>
-      <w:proofErr w:type="spellEnd"/>
-      <w:r>
-        <w:rPr>
-          <w:i/>
-          <w:iCs/>
-          <w:color w:val="555555"/>
-          <w:sz w:val="18"/>
-          <w:szCs w:val="18"/>
-        </w:rPr>
-        <w:t xml:space="preserve"> do banco. A origem é o SG do front, não um CIDR.</w:t>
+        <w:t>Tabela 4. Regras do Security Group do banco. A origem é o SG do front, não um CIDR.</w:t>
       </w:r>
     </w:p>
     <w:p>
@@ -4350,31 +2906,7 @@
         <w:spacing w:after="140" w:line="276" w:lineRule="auto"/>
       </w:pPr>
       <w:r>
-        <w:t xml:space="preserve">Referenciar o Security </w:t>
-      </w:r>
-      <w:proofErr w:type="spellStart"/>
-      <w:r>
-        <w:t>Group</w:t>
-      </w:r>
-      <w:proofErr w:type="spellEnd"/>
-      <w:r>
-        <w:t xml:space="preserve"> de origem, em vez de um CIDR, garante que apenas as instâncias do </w:t>
-      </w:r>
-      <w:proofErr w:type="spellStart"/>
-      <w:r>
-        <w:t>frontend</w:t>
-      </w:r>
-      <w:proofErr w:type="spellEnd"/>
-      <w:r>
-        <w:t xml:space="preserve"> conversem com o banco, mesmo que os endereços mudem. Essa é a barreira que faltava no ambiente </w:t>
-      </w:r>
-      <w:proofErr w:type="spellStart"/>
-      <w:r>
-        <w:t>on-premises</w:t>
-      </w:r>
-      <w:proofErr w:type="spellEnd"/>
-      <w:r>
-        <w:t>, onde web e banco dividiam o mesmo segmento público.</w:t>
+        <w:t>Referenciar o Security Group de origem, em vez de um CIDR, garante que apenas as instâncias do frontend conversem com o banco, mesmo que os endereços mudem. Essa é a barreira que faltava no ambiente on-premises, onde web e banco dividiam o mesmo segmento público.</w:t>
       </w:r>
     </w:p>
     <w:p>
@@ -4408,7 +2940,7 @@
           <w:left w:w="10" w:type="dxa"/>
           <w:right w:w="10" w:type="dxa"/>
         </w:tblCellMar>
-        <w:tblLook w:val="04A0" w:firstRow="1" w:lastRow="0" w:firstColumn="1" w:lastColumn="0" w:noHBand="0" w:noVBand="1"/>
+        <w:tblLook w:val="0000" w:firstRow="0" w:lastRow="0" w:firstColumn="0" w:lastColumn="0" w:noHBand="0" w:noVBand="0"/>
       </w:tblPr>
       <w:tblGrid>
         <w:gridCol w:w="2300"/>
@@ -4539,18 +3071,8 @@
                 <w:sz w:val="19"/>
                 <w:szCs w:val="19"/>
               </w:rPr>
-              <w:t xml:space="preserve">Network </w:t>
-            </w:r>
-            <w:proofErr w:type="spellStart"/>
-            <w:r>
-              <w:rPr>
-                <w:color w:val="111111"/>
-                <w:sz w:val="19"/>
-                <w:szCs w:val="19"/>
-              </w:rPr>
-              <w:t>ACLs</w:t>
-            </w:r>
-            <w:proofErr w:type="spellEnd"/>
+              <w:t>Network ACLs</w:t>
+            </w:r>
           </w:p>
         </w:tc>
         <w:tc>
@@ -4575,43 +3097,7 @@
                 <w:sz w:val="19"/>
                 <w:szCs w:val="19"/>
               </w:rPr>
-              <w:t xml:space="preserve">Filtro </w:t>
-            </w:r>
-            <w:proofErr w:type="spellStart"/>
-            <w:r>
-              <w:rPr>
-                <w:color w:val="111111"/>
-                <w:sz w:val="19"/>
-                <w:szCs w:val="19"/>
-              </w:rPr>
-              <w:t>stateless</w:t>
-            </w:r>
-            <w:proofErr w:type="spellEnd"/>
-            <w:r>
-              <w:rPr>
-                <w:color w:val="111111"/>
-                <w:sz w:val="19"/>
-                <w:szCs w:val="19"/>
-              </w:rPr>
-              <w:t xml:space="preserve"> por </w:t>
-            </w:r>
-            <w:proofErr w:type="spellStart"/>
-            <w:r>
-              <w:rPr>
-                <w:color w:val="111111"/>
-                <w:sz w:val="19"/>
-                <w:szCs w:val="19"/>
-              </w:rPr>
-              <w:t>sub-rede</w:t>
-            </w:r>
-            <w:proofErr w:type="spellEnd"/>
-            <w:r>
-              <w:rPr>
-                <w:color w:val="111111"/>
-                <w:sz w:val="19"/>
-                <w:szCs w:val="19"/>
-              </w:rPr>
-              <w:t>. A NACL privada só aceita 3306 de dentro da VPC e portas efêmeras; bloqueia entrada direta da internet.</w:t>
+              <w:t>Filtro stateless por sub-rede. A NACL privada só aceita 3306 de dentro da VPC e portas efêmeras; bloqueia entrada direta da internet.</w:t>
             </w:r>
           </w:p>
         </w:tc>
@@ -4671,7 +3157,8 @@
                 <w:sz w:val="19"/>
                 <w:szCs w:val="19"/>
               </w:rPr>
-              <w:t>NAT Gateway</w:t>
+              <w:lastRenderedPageBreak/>
+              <w:t>Sub-rede privada sem saída</w:t>
             </w:r>
           </w:p>
         </w:tc>
@@ -4697,25 +3184,7 @@
                 <w:sz w:val="19"/>
                 <w:szCs w:val="19"/>
               </w:rPr>
-              <w:t xml:space="preserve">Dá saída à </w:t>
-            </w:r>
-            <w:proofErr w:type="spellStart"/>
-            <w:r>
-              <w:rPr>
-                <w:color w:val="111111"/>
-                <w:sz w:val="19"/>
-                <w:szCs w:val="19"/>
-              </w:rPr>
-              <w:t>sub-rede</w:t>
-            </w:r>
-            <w:proofErr w:type="spellEnd"/>
-            <w:r>
-              <w:rPr>
-                <w:color w:val="111111"/>
-                <w:sz w:val="19"/>
-                <w:szCs w:val="19"/>
-              </w:rPr>
-              <w:t xml:space="preserve"> privada sem aceitar conexões de entrada. O banco nunca fica exposto.</w:t>
+              <w:t>A sub-rede do banco não tem rota para a internet (sem NAT). O RDS não inicia conexões externas e nunca fica exposto.</w:t>
             </w:r>
           </w:p>
         </w:tc>
@@ -4775,7 +3244,6 @@
                 <w:sz w:val="19"/>
                 <w:szCs w:val="19"/>
               </w:rPr>
-              <w:lastRenderedPageBreak/>
               <w:t>WAF com regras gerenciadas</w:t>
             </w:r>
           </w:p>
@@ -4802,43 +3270,7 @@
                 <w:sz w:val="19"/>
                 <w:szCs w:val="19"/>
               </w:rPr>
-              <w:t xml:space="preserve">Bloqueia ataques comuns (OWASP), </w:t>
-            </w:r>
-            <w:proofErr w:type="spellStart"/>
-            <w:r>
-              <w:rPr>
-                <w:color w:val="111111"/>
-                <w:sz w:val="19"/>
-                <w:szCs w:val="19"/>
-              </w:rPr>
-              <w:t>IPs</w:t>
-            </w:r>
-            <w:proofErr w:type="spellEnd"/>
-            <w:r>
-              <w:rPr>
-                <w:color w:val="111111"/>
-                <w:sz w:val="19"/>
-                <w:szCs w:val="19"/>
-              </w:rPr>
-              <w:t xml:space="preserve"> de má reputação e aplica rate </w:t>
-            </w:r>
-            <w:proofErr w:type="spellStart"/>
-            <w:r>
-              <w:rPr>
-                <w:color w:val="111111"/>
-                <w:sz w:val="19"/>
-                <w:szCs w:val="19"/>
-              </w:rPr>
-              <w:t>limit</w:t>
-            </w:r>
-            <w:proofErr w:type="spellEnd"/>
-            <w:r>
-              <w:rPr>
-                <w:color w:val="111111"/>
-                <w:sz w:val="19"/>
-                <w:szCs w:val="19"/>
-              </w:rPr>
-              <w:t xml:space="preserve"> de 2000 requisições por IP.</w:t>
+              <w:t>Bloqueia ataques comuns (OWASP), IPs de má reputação e aplica rate limit de 2000 requisições por IP.</w:t>
             </w:r>
           </w:p>
         </w:tc>
@@ -4918,23 +3350,13 @@
             <w:pPr>
               <w:spacing w:line="252" w:lineRule="auto"/>
             </w:pPr>
-            <w:proofErr w:type="spellStart"/>
-            <w:r>
-              <w:rPr>
-                <w:color w:val="111111"/>
-                <w:sz w:val="19"/>
-                <w:szCs w:val="19"/>
-              </w:rPr>
-              <w:t>CloudFront</w:t>
-            </w:r>
-            <w:proofErr w:type="spellEnd"/>
-            <w:r>
-              <w:rPr>
-                <w:color w:val="111111"/>
-                <w:sz w:val="19"/>
-                <w:szCs w:val="19"/>
-              </w:rPr>
-              <w:t xml:space="preserve"> redireciona todo acesso para HTTPS, atendendo o SLO de 100% do tráfego com TLS.</w:t>
+            <w:r>
+              <w:rPr>
+                <w:color w:val="111111"/>
+                <w:sz w:val="19"/>
+                <w:szCs w:val="19"/>
+              </w:rPr>
+              <w:t>CloudFront redireciona todo acesso para HTTPS, atendendo o SLO de 100% do tráfego com TLS.</w:t>
             </w:r>
           </w:p>
         </w:tc>
@@ -5100,59 +3522,13 @@
             <w:pPr>
               <w:spacing w:line="252" w:lineRule="auto"/>
             </w:pPr>
-            <w:proofErr w:type="spellStart"/>
-            <w:r>
-              <w:rPr>
-                <w:color w:val="111111"/>
-                <w:sz w:val="19"/>
-                <w:szCs w:val="19"/>
-              </w:rPr>
-              <w:t>Bucket</w:t>
-            </w:r>
-            <w:proofErr w:type="spellEnd"/>
-            <w:r>
-              <w:rPr>
-                <w:color w:val="111111"/>
-                <w:sz w:val="19"/>
-                <w:szCs w:val="19"/>
-              </w:rPr>
-              <w:t xml:space="preserve"> sem acesso público, criptografado e </w:t>
-            </w:r>
-            <w:proofErr w:type="spellStart"/>
-            <w:r>
-              <w:rPr>
-                <w:color w:val="111111"/>
-                <w:sz w:val="19"/>
-                <w:szCs w:val="19"/>
-              </w:rPr>
-              <w:t>versionado</w:t>
-            </w:r>
-            <w:proofErr w:type="spellEnd"/>
-            <w:r>
-              <w:rPr>
-                <w:color w:val="111111"/>
-                <w:sz w:val="19"/>
-                <w:szCs w:val="19"/>
-              </w:rPr>
-              <w:t xml:space="preserve">; só o </w:t>
-            </w:r>
-            <w:proofErr w:type="spellStart"/>
-            <w:r>
-              <w:rPr>
-                <w:color w:val="111111"/>
-                <w:sz w:val="19"/>
-                <w:szCs w:val="19"/>
-              </w:rPr>
-              <w:t>CloudFront</w:t>
-            </w:r>
-            <w:proofErr w:type="spellEnd"/>
-            <w:r>
-              <w:rPr>
-                <w:color w:val="111111"/>
-                <w:sz w:val="19"/>
-                <w:szCs w:val="19"/>
-              </w:rPr>
-              <w:t xml:space="preserve"> lê os objetos.</w:t>
+            <w:r>
+              <w:rPr>
+                <w:color w:val="111111"/>
+                <w:sz w:val="19"/>
+                <w:szCs w:val="19"/>
+              </w:rPr>
+              <w:t>Bucket sem acesso público, criptografado e versionado; só o CloudFront lê os objetos.</w:t>
             </w:r>
           </w:p>
         </w:tc>
@@ -5324,25 +3700,7 @@
                 <w:sz w:val="19"/>
                 <w:szCs w:val="19"/>
               </w:rPr>
-              <w:t xml:space="preserve">A EC2 só pode ler o </w:t>
-            </w:r>
-            <w:proofErr w:type="spellStart"/>
-            <w:r>
-              <w:rPr>
-                <w:color w:val="111111"/>
-                <w:sz w:val="19"/>
-                <w:szCs w:val="19"/>
-              </w:rPr>
-              <w:t>bucket</w:t>
-            </w:r>
-            <w:proofErr w:type="spellEnd"/>
-            <w:r>
-              <w:rPr>
-                <w:color w:val="111111"/>
-                <w:sz w:val="19"/>
-                <w:szCs w:val="19"/>
-              </w:rPr>
-              <w:t xml:space="preserve"> de estáticos e o segredo do banco, via perfil de instância.</w:t>
+              <w:t>A EC2 só pode ler o bucket de estáticos e o segredo do banco, via perfil de instância.</w:t>
             </w:r>
           </w:p>
         </w:tc>
@@ -5402,25 +3760,7 @@
                 <w:sz w:val="19"/>
                 <w:szCs w:val="19"/>
               </w:rPr>
-              <w:t xml:space="preserve">SSM </w:t>
-            </w:r>
-            <w:proofErr w:type="spellStart"/>
-            <w:r>
-              <w:rPr>
-                <w:color w:val="111111"/>
-                <w:sz w:val="19"/>
-                <w:szCs w:val="19"/>
-              </w:rPr>
-              <w:t>Session</w:t>
-            </w:r>
-            <w:proofErr w:type="spellEnd"/>
-            <w:r>
-              <w:rPr>
-                <w:color w:val="111111"/>
-                <w:sz w:val="19"/>
-                <w:szCs w:val="19"/>
-              </w:rPr>
-              <w:t xml:space="preserve"> Manager</w:t>
+              <w:t>SSM Session Manager</w:t>
             </w:r>
           </w:p>
         </w:tc>
@@ -5704,25 +4044,7 @@
                 <w:sz w:val="19"/>
                 <w:szCs w:val="19"/>
               </w:rPr>
-              <w:t xml:space="preserve">Registra todo o tráfego de rede no </w:t>
-            </w:r>
-            <w:proofErr w:type="spellStart"/>
-            <w:r>
-              <w:rPr>
-                <w:color w:val="111111"/>
-                <w:sz w:val="19"/>
-                <w:szCs w:val="19"/>
-              </w:rPr>
-              <w:t>CloudWatch</w:t>
-            </w:r>
-            <w:proofErr w:type="spellEnd"/>
-            <w:r>
-              <w:rPr>
-                <w:color w:val="111111"/>
-                <w:sz w:val="19"/>
-                <w:szCs w:val="19"/>
-              </w:rPr>
-              <w:t xml:space="preserve"> para auditoria e investigação de incidentes.</w:t>
+              <w:t>Registra todo o tráfego de rede no CloudWatch para auditoria e investigação de incidentes.</w:t>
             </w:r>
           </w:p>
         </w:tc>
@@ -5782,15 +4104,7 @@
         <w:t xml:space="preserve">Mapeamento com o checklist de Dia 1 do move2cloud. </w:t>
       </w:r>
       <w:r>
-        <w:t xml:space="preserve">O roteiro da disciplina exige seis cuidados no primeiro dia: contas com MFA, WAF, HTTPS em todo o tráfego, dados criptografados em repouso e em trânsito, segredos em cofre e logs centralizados. O MVP cobre WAF, HTTPS, criptografia (KMS no RDS e SSE no S3), Secrets Manager e Flow Logs. O MFA fica no nível da conta AWS e do usuário IAM que executa o </w:t>
-      </w:r>
-      <w:proofErr w:type="spellStart"/>
-      <w:r>
-        <w:t>Terraform</w:t>
-      </w:r>
-      <w:proofErr w:type="spellEnd"/>
-      <w:r>
-        <w:t>, conforme orienta o README.</w:t>
+        <w:t>O roteiro da disciplina exige seis cuidados no primeiro dia: contas com MFA, WAF, HTTPS em todo o tráfego, dados criptografados em repouso e em trânsito, segredos em cofre e logs centralizados. O MVP cobre WAF, HTTPS, criptografia (KMS no RDS e SSE no S3), Secrets Manager e Flow Logs. O MFA fica no nível da conta AWS e do usuário IAM que executa o Terraform, conforme orienta o README.</w:t>
       </w:r>
     </w:p>
     <w:p>
@@ -5812,55 +4126,7 @@
         <w:spacing w:after="140" w:line="276" w:lineRule="auto"/>
       </w:pPr>
       <w:r>
-        <w:t xml:space="preserve">O MVP resolve os três problemas que a consultoria apontou no ambiente </w:t>
-      </w:r>
-      <w:proofErr w:type="spellStart"/>
-      <w:r>
-        <w:t>on-premises</w:t>
-      </w:r>
-      <w:proofErr w:type="spellEnd"/>
-      <w:r>
-        <w:t xml:space="preserve"> da Mercantis. A indisponibilidade por falta de energia e a fragilidade física dão lugar à infraestrutura gerenciada da AWS, com backups automáticos e duas </w:t>
-      </w:r>
-      <w:proofErr w:type="spellStart"/>
-      <w:r>
-        <w:t>AZs</w:t>
-      </w:r>
-      <w:proofErr w:type="spellEnd"/>
-      <w:r>
-        <w:t xml:space="preserve"> já provisionadas na rede. O banco sai do segmento público e passa a viver em </w:t>
-      </w:r>
-      <w:proofErr w:type="spellStart"/>
-      <w:r>
-        <w:t>sub-rede</w:t>
-      </w:r>
-      <w:proofErr w:type="spellEnd"/>
-      <w:r>
-        <w:t xml:space="preserve"> privada, acessível apenas pelo </w:t>
-      </w:r>
-      <w:proofErr w:type="spellStart"/>
-      <w:r>
-        <w:t>frontend</w:t>
-      </w:r>
-      <w:proofErr w:type="spellEnd"/>
-      <w:r>
-        <w:t xml:space="preserve">, o que fecha o caminho de movimento lateral. A borda ganha WAF, Shield e </w:t>
-      </w:r>
-      <w:proofErr w:type="spellStart"/>
-      <w:r>
-        <w:t>CloudFront</w:t>
-      </w:r>
-      <w:proofErr w:type="spellEnd"/>
-      <w:r>
-        <w:t xml:space="preserve">, que inspecionam requisições, mitigam </w:t>
-      </w:r>
-      <w:proofErr w:type="spellStart"/>
-      <w:r>
-        <w:t>DDoS</w:t>
-      </w:r>
-      <w:proofErr w:type="spellEnd"/>
-      <w:r>
-        <w:t xml:space="preserve"> e distribuem conteúdo estático por regiões, atacando tanto a falta de filtragem quanto a lentidão nos picos.</w:t>
+        <w:t>O MVP resolve os três problemas que a consultoria apontou no ambiente on-premises da Mercantis. A indisponibilidade por falta de energia e a fragilidade física dão lugar à infraestrutura gerenciada da AWS, com backups automáticos e duas AZs já provisionadas na rede. O banco sai do segmento público e passa a viver em sub-rede privada, acessível apenas pelo frontend, o que fecha o caminho de movimento lateral. A borda ganha WAF, Shield e CloudFront, que inspecionam requisições, mitigam DDoS e distribuem conteúdo estático por regiões, atacando tanto a falta de filtragem quanto a lentidão nos picos.</w:t>
       </w:r>
     </w:p>
     <w:p>
@@ -5868,79 +4134,7 @@
         <w:spacing w:after="140" w:line="276" w:lineRule="auto"/>
       </w:pPr>
       <w:r>
-        <w:t xml:space="preserve">O </w:t>
-      </w:r>
-      <w:proofErr w:type="spellStart"/>
-      <w:r>
-        <w:t>Terraform</w:t>
-      </w:r>
-      <w:proofErr w:type="spellEnd"/>
-      <w:r>
-        <w:t xml:space="preserve"> entrega tudo isso como código reproduzível: um </w:t>
-      </w:r>
-      <w:proofErr w:type="spellStart"/>
-      <w:r>
-        <w:t>terraform</w:t>
-      </w:r>
-      <w:proofErr w:type="spellEnd"/>
-      <w:r>
-        <w:t xml:space="preserve"> </w:t>
-      </w:r>
-      <w:proofErr w:type="spellStart"/>
-      <w:r>
-        <w:t>apply</w:t>
-      </w:r>
-      <w:proofErr w:type="spellEnd"/>
-      <w:r>
-        <w:t xml:space="preserve"> sobe a infraestrutura, e um </w:t>
-      </w:r>
-      <w:proofErr w:type="spellStart"/>
-      <w:r>
-        <w:t>terraform</w:t>
-      </w:r>
-      <w:proofErr w:type="spellEnd"/>
-      <w:r>
-        <w:t xml:space="preserve"> </w:t>
-      </w:r>
-      <w:proofErr w:type="spellStart"/>
-      <w:r>
-        <w:t>destroy</w:t>
-      </w:r>
-      <w:proofErr w:type="spellEnd"/>
-      <w:r>
-        <w:t xml:space="preserve"> a remove. A separação em arquivos por domínio, como rede, segurança, compute, dados e borda, facilita a evolução para a arquitetura final, que acrescenta balanceador, auto </w:t>
-      </w:r>
-      <w:proofErr w:type="spellStart"/>
-      <w:r>
-        <w:t>scaling</w:t>
-      </w:r>
-      <w:proofErr w:type="spellEnd"/>
-      <w:r>
-        <w:t xml:space="preserve"> e </w:t>
-      </w:r>
-      <w:proofErr w:type="spellStart"/>
-      <w:r>
-        <w:t>Multi-AZ</w:t>
-      </w:r>
-      <w:proofErr w:type="spellEnd"/>
-      <w:r>
-        <w:t xml:space="preserve"> para cumprir integralmente os </w:t>
-      </w:r>
-      <w:proofErr w:type="spellStart"/>
-      <w:r>
-        <w:t>SLOs</w:t>
-      </w:r>
-      <w:proofErr w:type="spellEnd"/>
-      <w:r>
-        <w:t xml:space="preserve"> de 99,9% de disponibilidade, p95 de 300 </w:t>
-      </w:r>
-      <w:proofErr w:type="spellStart"/>
-      <w:r>
-        <w:t>ms</w:t>
-      </w:r>
-      <w:proofErr w:type="spellEnd"/>
-      <w:r>
-        <w:t>, RTO de 1 hora e RPO de 15 minutos.</w:t>
+        <w:t>O Terraform entrega tudo isso como código reproduzível: um terraform apply sobe a infraestrutura, e um terraform destroy a remove. A separação em arquivos por domínio, como rede, segurança, compute, dados e borda, facilita a evolução para a arquitetura final, que acrescenta balanceador, auto scaling e Multi-AZ para cumprir integralmente os SLOs de 99,9% de disponibilidade, p95 de 300 ms, RTO de 1 hora e RPO de 15 minutos.</w:t>
       </w:r>
     </w:p>
     <w:p>
@@ -5948,47 +4142,7 @@
         <w:spacing w:after="140" w:line="276" w:lineRule="auto"/>
       </w:pPr>
       <w:r>
-        <w:t xml:space="preserve">O próximo passo natural é publicar a imagem real do portal no ECR, ativar o </w:t>
-      </w:r>
-      <w:proofErr w:type="spellStart"/>
-      <w:r>
-        <w:t>Multi-AZ</w:t>
-      </w:r>
-      <w:proofErr w:type="spellEnd"/>
-      <w:r>
-        <w:t xml:space="preserve"> no RDS e introduzir o </w:t>
-      </w:r>
-      <w:proofErr w:type="spellStart"/>
-      <w:r>
-        <w:t>Application</w:t>
-      </w:r>
-      <w:proofErr w:type="spellEnd"/>
-      <w:r>
-        <w:t xml:space="preserve"> </w:t>
-      </w:r>
-      <w:proofErr w:type="spellStart"/>
-      <w:r>
-        <w:t>Load</w:t>
-      </w:r>
-      <w:proofErr w:type="spellEnd"/>
-      <w:r>
-        <w:t xml:space="preserve"> </w:t>
-      </w:r>
-      <w:proofErr w:type="spellStart"/>
-      <w:r>
-        <w:t>Balancer</w:t>
-      </w:r>
-      <w:proofErr w:type="spellEnd"/>
-      <w:r>
-        <w:t xml:space="preserve"> com auto </w:t>
-      </w:r>
-      <w:proofErr w:type="spellStart"/>
-      <w:r>
-        <w:t>scaling</w:t>
-      </w:r>
-      <w:proofErr w:type="spellEnd"/>
-      <w:r>
-        <w:t>. A base de segurança e rede do MVP sustenta essa transição sem retrabalho.</w:t>
+        <w:t>O próximo passo natural é publicar a imagem real do portal no ECR, ativar o Multi-AZ no RDS e introduzir o Application Load Balancer com auto scaling. A base de segurança e rede do MVP sustenta essa transição sem retrabalho.</w:t>
       </w:r>
     </w:p>
     <w:p>
@@ -6015,15 +4169,7 @@
         <w:spacing w:after="80" w:line="268" w:lineRule="auto"/>
       </w:pPr>
       <w:r>
-        <w:t xml:space="preserve">Estudo de caso Mercantis (TI5A — Cloud </w:t>
-      </w:r>
-      <w:proofErr w:type="spellStart"/>
-      <w:r>
-        <w:t>Computing</w:t>
-      </w:r>
-      <w:proofErr w:type="spellEnd"/>
-      <w:r>
-        <w:t>, ESPM 2026-I). estudo-de-caso.md.</w:t>
+        <w:t>Estudo de caso Mercantis (TI5A — Cloud Computing, ESPM 2026-I). estudo-de-caso.md.</w:t>
       </w:r>
     </w:p>
     <w:p>
@@ -6036,15 +4182,7 @@
         <w:spacing w:after="80" w:line="268" w:lineRule="auto"/>
       </w:pPr>
       <w:r>
-        <w:t xml:space="preserve">Roteiro Move2Cloud da Mercantis: metas, </w:t>
-      </w:r>
-      <w:proofErr w:type="spellStart"/>
-      <w:r>
-        <w:t>SLOs</w:t>
-      </w:r>
-      <w:proofErr w:type="spellEnd"/>
-      <w:r>
-        <w:t>, estratégias de migração e checklist de Dia 1. mercantis-move2cloud.md.</w:t>
+        <w:t>Roteiro Move2Cloud da Mercantis: metas, SLOs, estratégias de migração e checklist de Dia 1. mercantis-move2cloud.md.</w:t>
       </w:r>
     </w:p>
     <w:p>
@@ -6057,15 +4195,7 @@
         <w:spacing w:after="80" w:line="268" w:lineRule="auto"/>
       </w:pPr>
       <w:r>
-        <w:t xml:space="preserve">AWS </w:t>
-      </w:r>
-      <w:proofErr w:type="spellStart"/>
-      <w:r>
-        <w:t>Well-Architected</w:t>
-      </w:r>
-      <w:proofErr w:type="spellEnd"/>
-      <w:r>
-        <w:t xml:space="preserve"> Framework: pilar de segurança. conceitos-gerais-aws.md.</w:t>
+        <w:t>AWS Well-Architected Framework: pilar de segurança. conceitos-gerais-aws.md.</w:t>
       </w:r>
     </w:p>
     <w:p>
@@ -6078,39 +4208,7 @@
         <w:spacing w:after="80" w:line="268" w:lineRule="auto"/>
       </w:pPr>
       <w:r>
-        <w:t xml:space="preserve">Web </w:t>
-      </w:r>
-      <w:proofErr w:type="spellStart"/>
-      <w:r>
-        <w:t>Application</w:t>
-      </w:r>
-      <w:proofErr w:type="spellEnd"/>
-      <w:r>
-        <w:t xml:space="preserve"> </w:t>
-      </w:r>
-      <w:proofErr w:type="spellStart"/>
-      <w:r>
-        <w:t>Hosting</w:t>
-      </w:r>
-      <w:proofErr w:type="spellEnd"/>
-      <w:r>
-        <w:t xml:space="preserve"> in </w:t>
-      </w:r>
-      <w:proofErr w:type="spellStart"/>
-      <w:r>
-        <w:t>the</w:t>
-      </w:r>
-      <w:proofErr w:type="spellEnd"/>
-      <w:r>
-        <w:t xml:space="preserve"> AWS Cloud (</w:t>
-      </w:r>
-      <w:proofErr w:type="spellStart"/>
-      <w:r>
-        <w:t>whitepaper</w:t>
-      </w:r>
-      <w:proofErr w:type="spellEnd"/>
-      <w:r>
-        <w:t xml:space="preserve"> de referência). web-application-hosting-best-practices.md.</w:t>
+        <w:t>Web Application Hosting in the AWS Cloud (whitepaper de referência). web-application-hosting-best-practices.md.</w:t>
       </w:r>
     </w:p>
     <w:sectPr>
@@ -6295,10 +4393,96 @@
 <file path=word/numbering.xml><?xml version="1.0" encoding="utf-8"?>
 <w:numbering xmlns:wpc="http://schemas.microsoft.com/office/word/2010/wordprocessingCanvas" xmlns:cx="http://schemas.microsoft.com/office/drawing/2014/chartex" xmlns:cx1="http://schemas.microsoft.com/office/drawing/2015/9/8/chartex" xmlns:cx2="http://schemas.microsoft.com/office/drawing/2015/10/21/chartex" xmlns:cx3="http://schemas.microsoft.com/office/drawing/2016/5/9/chartex" xmlns:cx4="http://schemas.microsoft.com/office/drawing/2016/5/10/chartex" xmlns:cx5="http://schemas.microsoft.com/office/drawing/2016/5/11/chartex" xmlns:cx6="http://schemas.microsoft.com/office/drawing/2016/5/12/chartex" xmlns:cx7="http://schemas.microsoft.com/office/drawing/2016/5/13/chartex" xmlns:cx8="http://schemas.microsoft.com/office/drawing/2016/5/14/chartex" xmlns:mc="http://schemas.openxmlformats.org/markup-compatibility/2006" xmlns:aink="http://schemas.microsoft.com/office/drawing/2016/ink" xmlns:am3d="http://schemas.microsoft.com/office/drawing/2017/model3d" xmlns:o="urn:schemas-microsoft-com:office:office" xmlns:oel="http://schemas.microsoft.com/office/2019/extlst" xmlns:r="http://schemas.openxmlformats.org/officeDocument/2006/relationships" xmlns:m="http://schemas.openxmlformats.org/officeDocument/2006/math" xmlns:v="urn:schemas-microsoft-com:vml" xmlns:wp14="http://schemas.microsoft.com/office/word/2010/wordprocessingDrawing" xmlns:wp="http://schemas.openxmlformats.org/drawingml/2006/wordprocessingDrawing" xmlns:w10="urn:schemas-microsoft-com:office:word" xmlns:w="http://schemas.openxmlformats.org/wordprocessingml/2006/main" xmlns:w14="http://schemas.microsoft.com/office/word/2010/wordml" xmlns:w15="http://schemas.microsoft.com/office/word/2012/wordml" xmlns:w16cex="http://schemas.microsoft.com/office/word/2018/wordml/cex" xmlns:w16cid="http://schemas.microsoft.com/office/word/2016/wordml/cid" xmlns:w16="http://schemas.microsoft.com/office/word/2018/wordml" xmlns:w16du="http://schemas.microsoft.com/office/word/2023/wordml/word16du" xmlns:w16sdtdh="http://schemas.microsoft.com/office/word/2020/wordml/sdtdatahash" xmlns:w16sdtfl="http://schemas.microsoft.com/office/word/2024/wordml/sdtformatlock" xmlns:w16se="http://schemas.microsoft.com/office/word/2015/wordml/symex" xmlns:wpg="http://schemas.microsoft.com/office/word/2010/wordprocessingGroup" xmlns:wpi="http://schemas.microsoft.com/office/word/2010/wordprocessingInk" xmlns:wne="http://schemas.microsoft.com/office/word/2006/wordml" xmlns:wps="http://schemas.microsoft.com/office/word/2010/wordprocessingShape" mc:Ignorable="w14 w15 w16se w16cid w16 w16cex w16sdtdh w16sdtfl w16du wp14">
   <w:abstractNum w:abstractNumId="0" w15:restartNumberingAfterBreak="0">
-    <w:nsid w:val="43ED2274"/>
+    <w:nsid w:val="09F77E50"/>
     <w:multiLevelType w:val="hybridMultilevel"/>
-    <w:tmpl w:val="D542DAEC"/>
-    <w:lvl w:ilvl="0" w:tplc="27F65CC4">
+    <w:tmpl w:val="D1F2CE50"/>
+    <w:lvl w:ilvl="0" w:tplc="6F384A0A">
+      <w:start w:val="1"/>
+      <w:numFmt w:val="bullet"/>
+      <w:lvlText w:val="●"/>
+      <w:lvlJc w:val="left"/>
+      <w:pPr>
+        <w:ind w:left="720" w:hanging="360"/>
+      </w:pPr>
+    </w:lvl>
+    <w:lvl w:ilvl="1" w:tplc="BC6867C4">
+      <w:start w:val="1"/>
+      <w:numFmt w:val="bullet"/>
+      <w:lvlText w:val="○"/>
+      <w:lvlJc w:val="left"/>
+      <w:pPr>
+        <w:ind w:left="1440" w:hanging="360"/>
+      </w:pPr>
+    </w:lvl>
+    <w:lvl w:ilvl="2" w:tplc="69507A92">
+      <w:start w:val="1"/>
+      <w:numFmt w:val="bullet"/>
+      <w:lvlText w:val="■"/>
+      <w:lvlJc w:val="left"/>
+      <w:pPr>
+        <w:ind w:left="2160" w:hanging="360"/>
+      </w:pPr>
+    </w:lvl>
+    <w:lvl w:ilvl="3" w:tplc="AB2C4104">
+      <w:start w:val="1"/>
+      <w:numFmt w:val="bullet"/>
+      <w:lvlText w:val="●"/>
+      <w:lvlJc w:val="left"/>
+      <w:pPr>
+        <w:ind w:left="2880" w:hanging="360"/>
+      </w:pPr>
+    </w:lvl>
+    <w:lvl w:ilvl="4" w:tplc="91F04602">
+      <w:start w:val="1"/>
+      <w:numFmt w:val="bullet"/>
+      <w:lvlText w:val="○"/>
+      <w:lvlJc w:val="left"/>
+      <w:pPr>
+        <w:ind w:left="3600" w:hanging="360"/>
+      </w:pPr>
+    </w:lvl>
+    <w:lvl w:ilvl="5" w:tplc="37F2ADC0">
+      <w:start w:val="1"/>
+      <w:numFmt w:val="bullet"/>
+      <w:lvlText w:val="■"/>
+      <w:lvlJc w:val="left"/>
+      <w:pPr>
+        <w:ind w:left="4320" w:hanging="360"/>
+      </w:pPr>
+    </w:lvl>
+    <w:lvl w:ilvl="6" w:tplc="1FBE0550">
+      <w:start w:val="1"/>
+      <w:numFmt w:val="bullet"/>
+      <w:lvlText w:val="●"/>
+      <w:lvlJc w:val="left"/>
+      <w:pPr>
+        <w:ind w:left="5040" w:hanging="360"/>
+      </w:pPr>
+    </w:lvl>
+    <w:lvl w:ilvl="7" w:tplc="4A5C4098">
+      <w:start w:val="1"/>
+      <w:numFmt w:val="bullet"/>
+      <w:lvlText w:val="●"/>
+      <w:lvlJc w:val="left"/>
+      <w:pPr>
+        <w:ind w:left="5760" w:hanging="360"/>
+      </w:pPr>
+    </w:lvl>
+    <w:lvl w:ilvl="8" w:tplc="52E6A42C">
+      <w:start w:val="1"/>
+      <w:numFmt w:val="bullet"/>
+      <w:lvlText w:val="●"/>
+      <w:lvlJc w:val="left"/>
+      <w:pPr>
+        <w:ind w:left="6480" w:hanging="360"/>
+      </w:pPr>
+    </w:lvl>
+  </w:abstractNum>
+  <w:abstractNum w:abstractNumId="1" w15:restartNumberingAfterBreak="0">
+    <w:nsid w:val="3D854773"/>
+    <w:multiLevelType w:val="hybridMultilevel"/>
+    <w:tmpl w:val="A5E864A8"/>
+    <w:lvl w:ilvl="0" w:tplc="186097F0">
       <w:start w:val="1"/>
       <w:numFmt w:val="bullet"/>
       <w:lvlText w:val="•"/>
@@ -6307,141 +4491,55 @@
         <w:ind w:left="600" w:hanging="280"/>
       </w:pPr>
     </w:lvl>
-    <w:lvl w:ilvl="1" w:tplc="2BF0DF00">
+    <w:lvl w:ilvl="1" w:tplc="45E01C84">
       <w:numFmt w:val="decimal"/>
       <w:lvlText w:val=""/>
       <w:lvlJc w:val="left"/>
     </w:lvl>
-    <w:lvl w:ilvl="2" w:tplc="8A74F59C">
+    <w:lvl w:ilvl="2" w:tplc="7B76CAB0">
       <w:numFmt w:val="decimal"/>
       <w:lvlText w:val=""/>
       <w:lvlJc w:val="left"/>
     </w:lvl>
-    <w:lvl w:ilvl="3" w:tplc="26B20208">
+    <w:lvl w:ilvl="3" w:tplc="58C03C0C">
       <w:numFmt w:val="decimal"/>
       <w:lvlText w:val=""/>
       <w:lvlJc w:val="left"/>
     </w:lvl>
-    <w:lvl w:ilvl="4" w:tplc="4D5AED88">
+    <w:lvl w:ilvl="4" w:tplc="EC96C3D8">
       <w:numFmt w:val="decimal"/>
       <w:lvlText w:val=""/>
       <w:lvlJc w:val="left"/>
     </w:lvl>
-    <w:lvl w:ilvl="5" w:tplc="3F8AFA4A">
+    <w:lvl w:ilvl="5" w:tplc="DBBC41DE">
       <w:numFmt w:val="decimal"/>
       <w:lvlText w:val=""/>
       <w:lvlJc w:val="left"/>
     </w:lvl>
-    <w:lvl w:ilvl="6" w:tplc="9C004F20">
+    <w:lvl w:ilvl="6" w:tplc="4C86FDC0">
       <w:numFmt w:val="decimal"/>
       <w:lvlText w:val=""/>
       <w:lvlJc w:val="left"/>
     </w:lvl>
-    <w:lvl w:ilvl="7" w:tplc="D416DDC0">
+    <w:lvl w:ilvl="7" w:tplc="57C0CE9C">
       <w:numFmt w:val="decimal"/>
       <w:lvlText w:val=""/>
       <w:lvlJc w:val="left"/>
     </w:lvl>
-    <w:lvl w:ilvl="8" w:tplc="C12EA318">
+    <w:lvl w:ilvl="8" w:tplc="D7D6D7E4">
       <w:numFmt w:val="decimal"/>
       <w:lvlText w:val=""/>
       <w:lvlJc w:val="left"/>
     </w:lvl>
   </w:abstractNum>
-  <w:abstractNum w:abstractNumId="1" w15:restartNumberingAfterBreak="0">
-    <w:nsid w:val="517417AD"/>
-    <w:multiLevelType w:val="hybridMultilevel"/>
-    <w:tmpl w:val="BD366EC2"/>
-    <w:lvl w:ilvl="0" w:tplc="7AC8F12C">
-      <w:start w:val="1"/>
-      <w:numFmt w:val="bullet"/>
-      <w:lvlText w:val="●"/>
-      <w:lvlJc w:val="left"/>
-      <w:pPr>
-        <w:ind w:left="720" w:hanging="360"/>
-      </w:pPr>
-    </w:lvl>
-    <w:lvl w:ilvl="1" w:tplc="E640A8E2">
-      <w:start w:val="1"/>
-      <w:numFmt w:val="bullet"/>
-      <w:lvlText w:val="○"/>
-      <w:lvlJc w:val="left"/>
-      <w:pPr>
-        <w:ind w:left="1440" w:hanging="360"/>
-      </w:pPr>
-    </w:lvl>
-    <w:lvl w:ilvl="2" w:tplc="5302FE6A">
-      <w:start w:val="1"/>
-      <w:numFmt w:val="bullet"/>
-      <w:lvlText w:val="■"/>
-      <w:lvlJc w:val="left"/>
-      <w:pPr>
-        <w:ind w:left="2160" w:hanging="360"/>
-      </w:pPr>
-    </w:lvl>
-    <w:lvl w:ilvl="3" w:tplc="ECBEECB4">
-      <w:start w:val="1"/>
-      <w:numFmt w:val="bullet"/>
-      <w:lvlText w:val="●"/>
-      <w:lvlJc w:val="left"/>
-      <w:pPr>
-        <w:ind w:left="2880" w:hanging="360"/>
-      </w:pPr>
-    </w:lvl>
-    <w:lvl w:ilvl="4" w:tplc="58123222">
-      <w:start w:val="1"/>
-      <w:numFmt w:val="bullet"/>
-      <w:lvlText w:val="○"/>
-      <w:lvlJc w:val="left"/>
-      <w:pPr>
-        <w:ind w:left="3600" w:hanging="360"/>
-      </w:pPr>
-    </w:lvl>
-    <w:lvl w:ilvl="5" w:tplc="AA16884E">
-      <w:start w:val="1"/>
-      <w:numFmt w:val="bullet"/>
-      <w:lvlText w:val="■"/>
-      <w:lvlJc w:val="left"/>
-      <w:pPr>
-        <w:ind w:left="4320" w:hanging="360"/>
-      </w:pPr>
-    </w:lvl>
-    <w:lvl w:ilvl="6" w:tplc="8488C392">
-      <w:start w:val="1"/>
-      <w:numFmt w:val="bullet"/>
-      <w:lvlText w:val="●"/>
-      <w:lvlJc w:val="left"/>
-      <w:pPr>
-        <w:ind w:left="5040" w:hanging="360"/>
-      </w:pPr>
-    </w:lvl>
-    <w:lvl w:ilvl="7" w:tplc="490E0052">
-      <w:start w:val="1"/>
-      <w:numFmt w:val="bullet"/>
-      <w:lvlText w:val="●"/>
-      <w:lvlJc w:val="left"/>
-      <w:pPr>
-        <w:ind w:left="5760" w:hanging="360"/>
-      </w:pPr>
-    </w:lvl>
-    <w:lvl w:ilvl="8" w:tplc="ACF6D872">
-      <w:start w:val="1"/>
-      <w:numFmt w:val="bullet"/>
-      <w:lvlText w:val="●"/>
-      <w:lvlJc w:val="left"/>
-      <w:pPr>
-        <w:ind w:left="6480" w:hanging="360"/>
-      </w:pPr>
-    </w:lvl>
-  </w:abstractNum>
-  <w:num w:numId="1" w16cid:durableId="1452243771">
-    <w:abstractNumId w:val="1"/>
+  <w:num w:numId="1" w16cid:durableId="1527014371">
+    <w:abstractNumId w:val="0"/>
     <w:lvlOverride w:ilvl="0">
       <w:startOverride w:val="1"/>
     </w:lvlOverride>
   </w:num>
-  <w:num w:numId="2" w16cid:durableId="1418208634">
-    <w:abstractNumId w:val="0"/>
+  <w:num w:numId="2" w16cid:durableId="369762510">
+    <w:abstractNumId w:val="1"/>
     <w:lvlOverride w:ilvl="0">
       <w:startOverride w:val="1"/>
     </w:lvlOverride>

</xml_diff>

<commit_message>
free tier limitations fix
</commit_message>
<xml_diff>
--- a/docs/Documentacao_MVP_Mercantis.docx
+++ b/docs/Documentacao_MVP_Mercantis.docx
@@ -1160,7 +1160,7 @@
           <w:noProof/>
         </w:rPr>
         <w:drawing>
-          <wp:inline distT="0" distB="0" distL="0" distR="0" wp14:anchorId="2295DAFF" wp14:editId="69FF32BD">
+          <wp:inline distT="0" distB="0" distL="0" distR="0" wp14:anchorId="545B19FF" wp14:editId="460128D9">
             <wp:extent cx="5715000" cy="4171950"/>
             <wp:effectExtent l="0" t="0" r="0" b="0"/>
             <wp:docPr id="1" name="Diagrama da infraestrutura final da Mercantis" descr="Diagrama da infraestrutura final da Mercantis" title="Diagrama da infraestrutura final da Mercantis"/>
@@ -1333,10 +1333,10 @@
           <w:noProof/>
         </w:rPr>
         <w:drawing>
-          <wp:inline distT="0" distB="0" distL="0" distR="0" wp14:anchorId="7E4A6F26" wp14:editId="0896F3A1">
+          <wp:inline distT="0" distB="0" distL="0" distR="0" wp14:anchorId="3588E52C" wp14:editId="5FCCA8BE">
             <wp:extent cx="5715000" cy="3952875"/>
             <wp:effectExtent l="0" t="0" r="0" b="0"/>
-            <wp:docPr id="236455815" name="Diagrama da infraestrutura do MVP da Mercantis" descr="Diagrama da infraestrutura do MVP da Mercantis" title="Diagrama da infraestrutura do MVP da Mercantis"/>
+            <wp:docPr id="1661619828" name="Diagrama da infraestrutura do MVP da Mercantis" descr="Diagrama da infraestrutura do MVP da Mercantis" title="Diagrama da infraestrutura do MVP da Mercantis"/>
             <wp:cNvGraphicFramePr>
               <a:graphicFrameLocks xmlns:a="http://schemas.openxmlformats.org/drawingml/2006/main" noChangeAspect="1"/>
             </wp:cNvGraphicFramePr>
@@ -2294,118 +2294,6 @@
                 <w:sz w:val="19"/>
                 <w:szCs w:val="19"/>
               </w:rPr>
-              <w:t>Entrada</w:t>
-            </w:r>
-          </w:p>
-        </w:tc>
-        <w:tc>
-          <w:tcPr>
-            <w:tcW w:w="2200" w:type="dxa"/>
-            <w:shd w:val="clear" w:color="auto" w:fill="FFFFFF"/>
-            <w:tcMar>
-              <w:top w:w="60" w:type="dxa"/>
-              <w:left w:w="110" w:type="dxa"/>
-              <w:bottom w:w="60" w:type="dxa"/>
-              <w:right w:w="110" w:type="dxa"/>
-            </w:tcMar>
-            <w:vAlign w:val="center"/>
-          </w:tcPr>
-          <w:p>
-            <w:pPr>
-              <w:spacing w:line="252" w:lineRule="auto"/>
-            </w:pPr>
-            <w:r>
-              <w:rPr>
-                <w:color w:val="111111"/>
-                <w:sz w:val="19"/>
-                <w:szCs w:val="19"/>
-              </w:rPr>
-              <w:t>TCP 443</w:t>
-            </w:r>
-          </w:p>
-        </w:tc>
-        <w:tc>
-          <w:tcPr>
-            <w:tcW w:w="2860" w:type="dxa"/>
-            <w:shd w:val="clear" w:color="auto" w:fill="FFFFFF"/>
-            <w:tcMar>
-              <w:top w:w="60" w:type="dxa"/>
-              <w:left w:w="110" w:type="dxa"/>
-              <w:bottom w:w="60" w:type="dxa"/>
-              <w:right w:w="110" w:type="dxa"/>
-            </w:tcMar>
-            <w:vAlign w:val="center"/>
-          </w:tcPr>
-          <w:p>
-            <w:pPr>
-              <w:spacing w:line="252" w:lineRule="auto"/>
-            </w:pPr>
-            <w:r>
-              <w:rPr>
-                <w:color w:val="111111"/>
-                <w:sz w:val="19"/>
-                <w:szCs w:val="19"/>
-              </w:rPr>
-              <w:t>Prefix list do CloudFront</w:t>
-            </w:r>
-          </w:p>
-        </w:tc>
-        <w:tc>
-          <w:tcPr>
-            <w:tcW w:w="2800" w:type="dxa"/>
-            <w:shd w:val="clear" w:color="auto" w:fill="FFFFFF"/>
-            <w:tcMar>
-              <w:top w:w="60" w:type="dxa"/>
-              <w:left w:w="110" w:type="dxa"/>
-              <w:bottom w:w="60" w:type="dxa"/>
-              <w:right w:w="110" w:type="dxa"/>
-            </w:tcMar>
-            <w:vAlign w:val="center"/>
-          </w:tcPr>
-          <w:p>
-            <w:pPr>
-              <w:spacing w:line="252" w:lineRule="auto"/>
-            </w:pPr>
-            <w:r>
-              <w:rPr>
-                <w:color w:val="111111"/>
-                <w:sz w:val="19"/>
-                <w:szCs w:val="19"/>
-              </w:rPr>
-              <w:t>HTTPS somente do CloudFront</w:t>
-            </w:r>
-          </w:p>
-        </w:tc>
-      </w:tr>
-      <w:tr>
-        <w:tblPrEx>
-          <w:tblCellMar>
-            <w:top w:w="0" w:type="dxa"/>
-            <w:bottom w:w="0" w:type="dxa"/>
-          </w:tblCellMar>
-        </w:tblPrEx>
-        <w:tc>
-          <w:tcPr>
-            <w:tcW w:w="1500" w:type="dxa"/>
-            <w:shd w:val="clear" w:color="auto" w:fill="FFFFFF"/>
-            <w:tcMar>
-              <w:top w:w="60" w:type="dxa"/>
-              <w:left w:w="110" w:type="dxa"/>
-              <w:bottom w:w="60" w:type="dxa"/>
-              <w:right w:w="110" w:type="dxa"/>
-            </w:tcMar>
-            <w:vAlign w:val="center"/>
-          </w:tcPr>
-          <w:p>
-            <w:pPr>
-              <w:spacing w:line="252" w:lineRule="auto"/>
-            </w:pPr>
-            <w:r>
-              <w:rPr>
-                <w:color w:val="111111"/>
-                <w:sz w:val="19"/>
-                <w:szCs w:val="19"/>
-              </w:rPr>
               <w:t>Saída</w:t>
             </w:r>
           </w:p>
@@ -3157,7 +3045,6 @@
                 <w:sz w:val="19"/>
                 <w:szCs w:val="19"/>
               </w:rPr>
-              <w:lastRenderedPageBreak/>
               <w:t>Sub-rede privada sem saída</w:t>
             </w:r>
           </w:p>
@@ -3244,6 +3131,7 @@
                 <w:sz w:val="19"/>
                 <w:szCs w:val="19"/>
               </w:rPr>
+              <w:lastRenderedPageBreak/>
               <w:t>WAF com regras gerenciadas</w:t>
             </w:r>
           </w:p>
@@ -4126,7 +4014,7 @@
         <w:spacing w:after="140" w:line="276" w:lineRule="auto"/>
       </w:pPr>
       <w:r>
-        <w:t>O MVP resolve os três problemas que a consultoria apontou no ambiente on-premises da Mercantis. A indisponibilidade por falta de energia e a fragilidade física dão lugar à infraestrutura gerenciada da AWS, com backups automáticos e duas AZs já provisionadas na rede. O banco sai do segmento público e passa a viver em sub-rede privada, acessível apenas pelo frontend, o que fecha o caminho de movimento lateral. A borda ganha WAF, Shield e CloudFront, que inspecionam requisições, mitigam DDoS e distribuem conteúdo estático por regiões, atacando tanto a falta de filtragem quanto a lentidão nos picos.</w:t>
+        <w:t>O MVP resolve os três problemas que a consultoria apontou no ambiente on-premises da Mercantis. A indisponibilidade por falta de energia e a fragilidade física dão lugar à infraestrutura gerenciada da AWS, com duas AZs já provisionadas na rede e recuperação simplificada. O banco sai do segmento público e passa a viver em sub-rede privada, acessível apenas pelo frontend, o que fecha o caminho de movimento lateral. A borda ganha WAF, Shield e CloudFront, que inspecionam requisições, mitigam DDoS e distribuem conteúdo estático por regiões, atacando tanto a falta de filtragem quanto a lentidão nos picos.</w:t>
       </w:r>
     </w:p>
     <w:p>
@@ -4393,96 +4281,10 @@
 <file path=word/numbering.xml><?xml version="1.0" encoding="utf-8"?>
 <w:numbering xmlns:wpc="http://schemas.microsoft.com/office/word/2010/wordprocessingCanvas" xmlns:cx="http://schemas.microsoft.com/office/drawing/2014/chartex" xmlns:cx1="http://schemas.microsoft.com/office/drawing/2015/9/8/chartex" xmlns:cx2="http://schemas.microsoft.com/office/drawing/2015/10/21/chartex" xmlns:cx3="http://schemas.microsoft.com/office/drawing/2016/5/9/chartex" xmlns:cx4="http://schemas.microsoft.com/office/drawing/2016/5/10/chartex" xmlns:cx5="http://schemas.microsoft.com/office/drawing/2016/5/11/chartex" xmlns:cx6="http://schemas.microsoft.com/office/drawing/2016/5/12/chartex" xmlns:cx7="http://schemas.microsoft.com/office/drawing/2016/5/13/chartex" xmlns:cx8="http://schemas.microsoft.com/office/drawing/2016/5/14/chartex" xmlns:mc="http://schemas.openxmlformats.org/markup-compatibility/2006" xmlns:aink="http://schemas.microsoft.com/office/drawing/2016/ink" xmlns:am3d="http://schemas.microsoft.com/office/drawing/2017/model3d" xmlns:o="urn:schemas-microsoft-com:office:office" xmlns:oel="http://schemas.microsoft.com/office/2019/extlst" xmlns:r="http://schemas.openxmlformats.org/officeDocument/2006/relationships" xmlns:m="http://schemas.openxmlformats.org/officeDocument/2006/math" xmlns:v="urn:schemas-microsoft-com:vml" xmlns:wp14="http://schemas.microsoft.com/office/word/2010/wordprocessingDrawing" xmlns:wp="http://schemas.openxmlformats.org/drawingml/2006/wordprocessingDrawing" xmlns:w10="urn:schemas-microsoft-com:office:word" xmlns:w="http://schemas.openxmlformats.org/wordprocessingml/2006/main" xmlns:w14="http://schemas.microsoft.com/office/word/2010/wordml" xmlns:w15="http://schemas.microsoft.com/office/word/2012/wordml" xmlns:w16cex="http://schemas.microsoft.com/office/word/2018/wordml/cex" xmlns:w16cid="http://schemas.microsoft.com/office/word/2016/wordml/cid" xmlns:w16="http://schemas.microsoft.com/office/word/2018/wordml" xmlns:w16du="http://schemas.microsoft.com/office/word/2023/wordml/word16du" xmlns:w16sdtdh="http://schemas.microsoft.com/office/word/2020/wordml/sdtdatahash" xmlns:w16sdtfl="http://schemas.microsoft.com/office/word/2024/wordml/sdtformatlock" xmlns:w16se="http://schemas.microsoft.com/office/word/2015/wordml/symex" xmlns:wpg="http://schemas.microsoft.com/office/word/2010/wordprocessingGroup" xmlns:wpi="http://schemas.microsoft.com/office/word/2010/wordprocessingInk" xmlns:wne="http://schemas.microsoft.com/office/word/2006/wordml" xmlns:wps="http://schemas.microsoft.com/office/word/2010/wordprocessingShape" mc:Ignorable="w14 w15 w16se w16cid w16 w16cex w16sdtdh w16sdtfl w16du wp14">
   <w:abstractNum w:abstractNumId="0" w15:restartNumberingAfterBreak="0">
-    <w:nsid w:val="09F77E50"/>
+    <w:nsid w:val="46336435"/>
     <w:multiLevelType w:val="hybridMultilevel"/>
-    <w:tmpl w:val="D1F2CE50"/>
-    <w:lvl w:ilvl="0" w:tplc="6F384A0A">
-      <w:start w:val="1"/>
-      <w:numFmt w:val="bullet"/>
-      <w:lvlText w:val="●"/>
-      <w:lvlJc w:val="left"/>
-      <w:pPr>
-        <w:ind w:left="720" w:hanging="360"/>
-      </w:pPr>
-    </w:lvl>
-    <w:lvl w:ilvl="1" w:tplc="BC6867C4">
-      <w:start w:val="1"/>
-      <w:numFmt w:val="bullet"/>
-      <w:lvlText w:val="○"/>
-      <w:lvlJc w:val="left"/>
-      <w:pPr>
-        <w:ind w:left="1440" w:hanging="360"/>
-      </w:pPr>
-    </w:lvl>
-    <w:lvl w:ilvl="2" w:tplc="69507A92">
-      <w:start w:val="1"/>
-      <w:numFmt w:val="bullet"/>
-      <w:lvlText w:val="■"/>
-      <w:lvlJc w:val="left"/>
-      <w:pPr>
-        <w:ind w:left="2160" w:hanging="360"/>
-      </w:pPr>
-    </w:lvl>
-    <w:lvl w:ilvl="3" w:tplc="AB2C4104">
-      <w:start w:val="1"/>
-      <w:numFmt w:val="bullet"/>
-      <w:lvlText w:val="●"/>
-      <w:lvlJc w:val="left"/>
-      <w:pPr>
-        <w:ind w:left="2880" w:hanging="360"/>
-      </w:pPr>
-    </w:lvl>
-    <w:lvl w:ilvl="4" w:tplc="91F04602">
-      <w:start w:val="1"/>
-      <w:numFmt w:val="bullet"/>
-      <w:lvlText w:val="○"/>
-      <w:lvlJc w:val="left"/>
-      <w:pPr>
-        <w:ind w:left="3600" w:hanging="360"/>
-      </w:pPr>
-    </w:lvl>
-    <w:lvl w:ilvl="5" w:tplc="37F2ADC0">
-      <w:start w:val="1"/>
-      <w:numFmt w:val="bullet"/>
-      <w:lvlText w:val="■"/>
-      <w:lvlJc w:val="left"/>
-      <w:pPr>
-        <w:ind w:left="4320" w:hanging="360"/>
-      </w:pPr>
-    </w:lvl>
-    <w:lvl w:ilvl="6" w:tplc="1FBE0550">
-      <w:start w:val="1"/>
-      <w:numFmt w:val="bullet"/>
-      <w:lvlText w:val="●"/>
-      <w:lvlJc w:val="left"/>
-      <w:pPr>
-        <w:ind w:left="5040" w:hanging="360"/>
-      </w:pPr>
-    </w:lvl>
-    <w:lvl w:ilvl="7" w:tplc="4A5C4098">
-      <w:start w:val="1"/>
-      <w:numFmt w:val="bullet"/>
-      <w:lvlText w:val="●"/>
-      <w:lvlJc w:val="left"/>
-      <w:pPr>
-        <w:ind w:left="5760" w:hanging="360"/>
-      </w:pPr>
-    </w:lvl>
-    <w:lvl w:ilvl="8" w:tplc="52E6A42C">
-      <w:start w:val="1"/>
-      <w:numFmt w:val="bullet"/>
-      <w:lvlText w:val="●"/>
-      <w:lvlJc w:val="left"/>
-      <w:pPr>
-        <w:ind w:left="6480" w:hanging="360"/>
-      </w:pPr>
-    </w:lvl>
-  </w:abstractNum>
-  <w:abstractNum w:abstractNumId="1" w15:restartNumberingAfterBreak="0">
-    <w:nsid w:val="3D854773"/>
-    <w:multiLevelType w:val="hybridMultilevel"/>
-    <w:tmpl w:val="A5E864A8"/>
-    <w:lvl w:ilvl="0" w:tplc="186097F0">
+    <w:tmpl w:val="2AC2986C"/>
+    <w:lvl w:ilvl="0" w:tplc="DCDA3E16">
       <w:start w:val="1"/>
       <w:numFmt w:val="bullet"/>
       <w:lvlText w:val="•"/>
@@ -4491,55 +4293,141 @@
         <w:ind w:left="600" w:hanging="280"/>
       </w:pPr>
     </w:lvl>
-    <w:lvl w:ilvl="1" w:tplc="45E01C84">
+    <w:lvl w:ilvl="1" w:tplc="5D24B150">
       <w:numFmt w:val="decimal"/>
       <w:lvlText w:val=""/>
       <w:lvlJc w:val="left"/>
     </w:lvl>
-    <w:lvl w:ilvl="2" w:tplc="7B76CAB0">
+    <w:lvl w:ilvl="2" w:tplc="0204B4E4">
       <w:numFmt w:val="decimal"/>
       <w:lvlText w:val=""/>
       <w:lvlJc w:val="left"/>
     </w:lvl>
-    <w:lvl w:ilvl="3" w:tplc="58C03C0C">
+    <w:lvl w:ilvl="3" w:tplc="413058A8">
       <w:numFmt w:val="decimal"/>
       <w:lvlText w:val=""/>
       <w:lvlJc w:val="left"/>
     </w:lvl>
-    <w:lvl w:ilvl="4" w:tplc="EC96C3D8">
+    <w:lvl w:ilvl="4" w:tplc="BF9C7186">
       <w:numFmt w:val="decimal"/>
       <w:lvlText w:val=""/>
       <w:lvlJc w:val="left"/>
     </w:lvl>
-    <w:lvl w:ilvl="5" w:tplc="DBBC41DE">
+    <w:lvl w:ilvl="5" w:tplc="7F8826DC">
       <w:numFmt w:val="decimal"/>
       <w:lvlText w:val=""/>
       <w:lvlJc w:val="left"/>
     </w:lvl>
-    <w:lvl w:ilvl="6" w:tplc="4C86FDC0">
+    <w:lvl w:ilvl="6" w:tplc="30AA7436">
       <w:numFmt w:val="decimal"/>
       <w:lvlText w:val=""/>
       <w:lvlJc w:val="left"/>
     </w:lvl>
-    <w:lvl w:ilvl="7" w:tplc="57C0CE9C">
+    <w:lvl w:ilvl="7" w:tplc="C4DCCF0A">
       <w:numFmt w:val="decimal"/>
       <w:lvlText w:val=""/>
       <w:lvlJc w:val="left"/>
     </w:lvl>
-    <w:lvl w:ilvl="8" w:tplc="D7D6D7E4">
+    <w:lvl w:ilvl="8" w:tplc="34F02CE8">
       <w:numFmt w:val="decimal"/>
       <w:lvlText w:val=""/>
       <w:lvlJc w:val="left"/>
     </w:lvl>
   </w:abstractNum>
-  <w:num w:numId="1" w16cid:durableId="1527014371">
-    <w:abstractNumId w:val="0"/>
+  <w:abstractNum w:abstractNumId="1" w15:restartNumberingAfterBreak="0">
+    <w:nsid w:val="6494472E"/>
+    <w:multiLevelType w:val="hybridMultilevel"/>
+    <w:tmpl w:val="306CED22"/>
+    <w:lvl w:ilvl="0" w:tplc="F97A7F22">
+      <w:start w:val="1"/>
+      <w:numFmt w:val="bullet"/>
+      <w:lvlText w:val="●"/>
+      <w:lvlJc w:val="left"/>
+      <w:pPr>
+        <w:ind w:left="720" w:hanging="360"/>
+      </w:pPr>
+    </w:lvl>
+    <w:lvl w:ilvl="1" w:tplc="B5DC69C4">
+      <w:start w:val="1"/>
+      <w:numFmt w:val="bullet"/>
+      <w:lvlText w:val="○"/>
+      <w:lvlJc w:val="left"/>
+      <w:pPr>
+        <w:ind w:left="1440" w:hanging="360"/>
+      </w:pPr>
+    </w:lvl>
+    <w:lvl w:ilvl="2" w:tplc="09D6A6A4">
+      <w:start w:val="1"/>
+      <w:numFmt w:val="bullet"/>
+      <w:lvlText w:val="■"/>
+      <w:lvlJc w:val="left"/>
+      <w:pPr>
+        <w:ind w:left="2160" w:hanging="360"/>
+      </w:pPr>
+    </w:lvl>
+    <w:lvl w:ilvl="3" w:tplc="6FEAD4E6">
+      <w:start w:val="1"/>
+      <w:numFmt w:val="bullet"/>
+      <w:lvlText w:val="●"/>
+      <w:lvlJc w:val="left"/>
+      <w:pPr>
+        <w:ind w:left="2880" w:hanging="360"/>
+      </w:pPr>
+    </w:lvl>
+    <w:lvl w:ilvl="4" w:tplc="1D00CF14">
+      <w:start w:val="1"/>
+      <w:numFmt w:val="bullet"/>
+      <w:lvlText w:val="○"/>
+      <w:lvlJc w:val="left"/>
+      <w:pPr>
+        <w:ind w:left="3600" w:hanging="360"/>
+      </w:pPr>
+    </w:lvl>
+    <w:lvl w:ilvl="5" w:tplc="CE38E64A">
+      <w:start w:val="1"/>
+      <w:numFmt w:val="bullet"/>
+      <w:lvlText w:val="■"/>
+      <w:lvlJc w:val="left"/>
+      <w:pPr>
+        <w:ind w:left="4320" w:hanging="360"/>
+      </w:pPr>
+    </w:lvl>
+    <w:lvl w:ilvl="6" w:tplc="340CFF14">
+      <w:start w:val="1"/>
+      <w:numFmt w:val="bullet"/>
+      <w:lvlText w:val="●"/>
+      <w:lvlJc w:val="left"/>
+      <w:pPr>
+        <w:ind w:left="5040" w:hanging="360"/>
+      </w:pPr>
+    </w:lvl>
+    <w:lvl w:ilvl="7" w:tplc="4894C3A8">
+      <w:start w:val="1"/>
+      <w:numFmt w:val="bullet"/>
+      <w:lvlText w:val="●"/>
+      <w:lvlJc w:val="left"/>
+      <w:pPr>
+        <w:ind w:left="5760" w:hanging="360"/>
+      </w:pPr>
+    </w:lvl>
+    <w:lvl w:ilvl="8" w:tplc="C14E6286">
+      <w:start w:val="1"/>
+      <w:numFmt w:val="bullet"/>
+      <w:lvlText w:val="●"/>
+      <w:lvlJc w:val="left"/>
+      <w:pPr>
+        <w:ind w:left="6480" w:hanging="360"/>
+      </w:pPr>
+    </w:lvl>
+  </w:abstractNum>
+  <w:num w:numId="1" w16cid:durableId="121117000">
+    <w:abstractNumId w:val="1"/>
     <w:lvlOverride w:ilvl="0">
       <w:startOverride w:val="1"/>
     </w:lvlOverride>
   </w:num>
-  <w:num w:numId="2" w16cid:durableId="369762510">
-    <w:abstractNumId w:val="1"/>
+  <w:num w:numId="2" w16cid:durableId="758911485">
+    <w:abstractNumId w:val="0"/>
     <w:lvlOverride w:ilvl="0">
       <w:startOverride w:val="1"/>
     </w:lvlOverride>

</xml_diff>